<commit_message>
Add classification metrics details (5.7), ROC-AUC/PR-AUC references, and update PDF
</commit_message>
<xml_diff>
--- a/เค้าโครงโครงงานคอมพิวเตอร์-ฉบับปรับปรุง-แก้ครบ.docx
+++ b/เค้าโครงโครงงานคอมพิวเตอร์-ฉบับปรับปรุง-แก้ครบ.docx
@@ -251,7 +251,6 @@
         <w:t xml:space="preserve"> </w:t>
       </w:r>
       <w:proofErr w:type="spellStart"/>
-      <w:proofErr w:type="gramStart"/>
       <w:r>
         <w:rPr>
           <w:sz w:val="36"/>
@@ -276,7 +275,6 @@
         <w:t>รหัสประจำตัว</w:t>
       </w:r>
       <w:proofErr w:type="spellEnd"/>
-      <w:proofErr w:type="gramEnd"/>
       <w:r>
         <w:rPr>
           <w:sz w:val="36"/>
@@ -310,7 +308,6 @@
         <w:t xml:space="preserve"> </w:t>
       </w:r>
       <w:proofErr w:type="spellStart"/>
-      <w:proofErr w:type="gramStart"/>
       <w:r>
         <w:rPr>
           <w:sz w:val="36"/>
@@ -335,7 +332,6 @@
         <w:t>รหัสประจำตัว</w:t>
       </w:r>
       <w:proofErr w:type="spellEnd"/>
-      <w:proofErr w:type="gramEnd"/>
       <w:r>
         <w:rPr>
           <w:sz w:val="36"/>
@@ -355,7 +351,6 @@
         </w:rPr>
       </w:pPr>
       <w:proofErr w:type="spellStart"/>
-      <w:proofErr w:type="gramStart"/>
       <w:r>
         <w:rPr>
           <w:sz w:val="36"/>
@@ -377,15 +372,7 @@
           <w:sz w:val="36"/>
           <w:szCs w:val="36"/>
         </w:rPr>
-        <w:t>อ.</w:t>
-      </w:r>
-      <w:proofErr w:type="gramEnd"/>
-      <w:r>
-        <w:rPr>
-          <w:sz w:val="36"/>
-          <w:szCs w:val="36"/>
-        </w:rPr>
-        <w:t>ดร.พบพร</w:t>
+        <w:t>อ.ดร.พบพร</w:t>
       </w:r>
       <w:proofErr w:type="spellEnd"/>
       <w:r>
@@ -604,7 +591,6 @@
         <w:jc w:val="center"/>
       </w:pPr>
       <w:proofErr w:type="spellStart"/>
-      <w:proofErr w:type="gramStart"/>
       <w:r>
         <w:rPr>
           <w:sz w:val="32"/>
@@ -629,7 +615,6 @@
         <w:t>วิทยาลัยการคอมพิวเตอร์</w:t>
       </w:r>
       <w:proofErr w:type="spellEnd"/>
-      <w:proofErr w:type="gramEnd"/>
       <w:r>
         <w:rPr>
           <w:sz w:val="32"/>
@@ -674,7 +659,6 @@
         <w:t xml:space="preserve"> </w:t>
       </w:r>
       <w:proofErr w:type="spellStart"/>
-      <w:proofErr w:type="gramStart"/>
       <w:r>
         <w:t>ตุ่นป่า</w:t>
       </w:r>
@@ -687,7 +671,6 @@
         <w:t>รหัสประจำตัว</w:t>
       </w:r>
       <w:proofErr w:type="spellEnd"/>
-      <w:proofErr w:type="gramEnd"/>
       <w:r>
         <w:t xml:space="preserve"> 673380280-2</w:t>
       </w:r>
@@ -726,7 +709,6 @@
         <w:t xml:space="preserve"> </w:t>
       </w:r>
       <w:proofErr w:type="spellStart"/>
-      <w:proofErr w:type="gramStart"/>
       <w:r>
         <w:t>คำตุ้ม</w:t>
       </w:r>
@@ -739,7 +721,6 @@
         <w:t>รหัสประจำตัว</w:t>
       </w:r>
       <w:proofErr w:type="spellEnd"/>
-      <w:proofErr w:type="gramEnd"/>
       <w:r>
         <w:t xml:space="preserve"> 673380066-4</w:t>
       </w:r>
@@ -876,7 +857,6 @@
         <w:ind w:left="2160" w:hanging="1440"/>
       </w:pPr>
       <w:proofErr w:type="spellStart"/>
-      <w:proofErr w:type="gramStart"/>
       <w:r>
         <w:t>ภาษาไทย</w:t>
       </w:r>
@@ -884,7 +864,6 @@
       <w:r>
         <w:t xml:space="preserve"> :</w:t>
       </w:r>
-      <w:proofErr w:type="gramEnd"/>
       <w:r>
         <w:tab/>
       </w:r>
@@ -914,7 +893,6 @@
         </w:rPr>
       </w:pPr>
       <w:proofErr w:type="spellStart"/>
-      <w:proofErr w:type="gramStart"/>
       <w:r>
         <w:t>ภาษาอังกฤษ</w:t>
       </w:r>
@@ -922,7 +900,6 @@
       <w:r>
         <w:t xml:space="preserve"> :</w:t>
       </w:r>
-      <w:proofErr w:type="gramEnd"/>
       <w:r>
         <w:tab/>
         <w:t>Enhancing Chest X-RAY Infiltration Detection Using Noise Reduction and Explainable AI</w:t>
@@ -2542,13 +2519,8 @@
         </w:rPr>
         <w:t xml:space="preserve">ในรูป </w:t>
       </w:r>
-      <w:proofErr w:type="gramStart"/>
-      <w:r>
-        <w:t>I(</w:t>
-      </w:r>
-      <w:proofErr w:type="gramEnd"/>
-      <w:r>
-        <w:t xml:space="preserve">1 + n) </w:t>
+      <w:r>
+        <w:t xml:space="preserve">I(1 + n) </w:t>
       </w:r>
       <w:r>
         <w:rPr>
@@ -4196,15 +4168,7 @@
           <w:b/>
           <w:bCs/>
         </w:rPr>
-        <w:t xml:space="preserve"> </w:t>
-      </w:r>
-      <w:proofErr w:type="gramStart"/>
-      <w:r>
-        <w:rPr>
-          <w:b/>
-          <w:bCs/>
-        </w:rPr>
-        <w:t>1</w:t>
+        <w:t xml:space="preserve"> 1</w:t>
       </w:r>
       <w:r>
         <w:t xml:space="preserve">  </w:t>
@@ -4214,7 +4178,6 @@
         <w:t>สภาวะการทดลองและพารามิเตอร์ของการทดลองที่</w:t>
       </w:r>
       <w:proofErr w:type="spellEnd"/>
-      <w:proofErr w:type="gramEnd"/>
       <w:r>
         <w:t xml:space="preserve"> 1</w:t>
       </w:r>
@@ -5989,15 +5952,7 @@
           <w:b/>
           <w:bCs/>
         </w:rPr>
-        <w:t xml:space="preserve"> </w:t>
-      </w:r>
-      <w:proofErr w:type="gramStart"/>
-      <w:r>
-        <w:rPr>
-          <w:b/>
-          <w:bCs/>
-        </w:rPr>
-        <w:t>2</w:t>
+        <w:t xml:space="preserve"> 2</w:t>
       </w:r>
       <w:r>
         <w:t xml:space="preserve">  </w:t>
@@ -6007,7 +5962,6 @@
         <w:t>พารามิเตอร์ของสัญญาณรบกวนจำลองแต่ละระดับความรุนแรง</w:t>
       </w:r>
       <w:proofErr w:type="spellEnd"/>
-      <w:proofErr w:type="gramEnd"/>
     </w:p>
     <w:tbl>
       <w:tblPr>
@@ -7123,15 +7077,7 @@
           <w:b/>
           <w:bCs/>
         </w:rPr>
-        <w:t xml:space="preserve"> </w:t>
-      </w:r>
-      <w:proofErr w:type="gramStart"/>
-      <w:r>
-        <w:rPr>
-          <w:b/>
-          <w:bCs/>
-        </w:rPr>
-        <w:t>3</w:t>
+        <w:t xml:space="preserve"> 3</w:t>
       </w:r>
       <w:r>
         <w:t xml:space="preserve">  </w:t>
@@ -7141,7 +7087,6 @@
         <w:t>วิธีการลดสัญญาณรบกวนและการรวมเทคนิคในการทดลองที่</w:t>
       </w:r>
       <w:proofErr w:type="spellEnd"/>
-      <w:proofErr w:type="gramEnd"/>
       <w:r>
         <w:t xml:space="preserve"> 2</w:t>
       </w:r>
@@ -8394,15 +8339,7 @@
           <w:b/>
           <w:bCs/>
         </w:rPr>
-        <w:t xml:space="preserve"> </w:t>
-      </w:r>
-      <w:proofErr w:type="gramStart"/>
-      <w:r>
-        <w:rPr>
-          <w:b/>
-          <w:bCs/>
-        </w:rPr>
-        <w:t>1</w:t>
+        <w:t xml:space="preserve"> 1</w:t>
       </w:r>
       <w:r>
         <w:t xml:space="preserve">  </w:t>
@@ -8412,7 +8349,6 @@
         <w:t>ตัวอย่างภาพ</w:t>
       </w:r>
       <w:proofErr w:type="spellEnd"/>
-      <w:proofErr w:type="gramEnd"/>
       <w:r>
         <w:t xml:space="preserve"> Infiltration </w:t>
       </w:r>
@@ -9445,31 +9381,176 @@
         <w:ind w:firstLine="720"/>
         <w:jc w:val="both"/>
         <w:rPr>
+          <w:rFonts w:ascii="TH SarabunPSK" w:hAnsi="TH SarabunPSK" w:cs="TH SarabunPSK"/>
+        </w:rPr>
+      </w:pPr>
+      <w:r>
+        <w:rPr>
+          <w:rFonts w:ascii="TH SarabunPSK" w:hAnsi="TH SarabunPSK" w:cs="TH SarabunPSK"/>
+          <w:cs/>
+        </w:rPr>
+        <w:t>ประเมินประสิทธิภาพของแบบจำลองในการจำแนกภาวะปอดอักเสบแทรกซึม (</w:t>
+      </w:r>
+      <w:r>
+        <w:rPr>
+          <w:rFonts w:ascii="TH SarabunPSK" w:hAnsi="TH SarabunPSK" w:cs="TH SarabunPSK"/>
+        </w:rPr>
+        <w:t xml:space="preserve">Infiltration) </w:t>
+      </w:r>
+      <w:r>
+        <w:rPr>
+          <w:rFonts w:ascii="TH SarabunPSK" w:hAnsi="TH SarabunPSK" w:cs="TH SarabunPSK"/>
+          <w:cs/>
+        </w:rPr>
+        <w:t>เทียบกับปอดปกติ (</w:t>
+      </w:r>
+      <w:r>
+        <w:rPr>
+          <w:rFonts w:ascii="TH SarabunPSK" w:hAnsi="TH SarabunPSK" w:cs="TH SarabunPSK"/>
+        </w:rPr>
+        <w:t xml:space="preserve">No Finding) </w:t>
+      </w:r>
+      <w:r>
+        <w:rPr>
+          <w:rFonts w:ascii="TH SarabunPSK" w:hAnsi="TH SarabunPSK" w:cs="TH SarabunPSK"/>
+          <w:cs/>
+        </w:rPr>
+        <w:t>บนชุดข้อมูลทดสอบผ่านเมทริก</w:t>
+      </w:r>
+      <w:proofErr w:type="spellStart"/>
+      <w:r>
+        <w:rPr>
+          <w:rFonts w:ascii="TH SarabunPSK" w:hAnsi="TH SarabunPSK" w:cs="TH SarabunPSK"/>
+          <w:cs/>
+        </w:rPr>
+        <w:t>ซ์</w:t>
+      </w:r>
+      <w:proofErr w:type="spellEnd"/>
+      <w:r>
+        <w:rPr>
+          <w:rFonts w:ascii="TH SarabunPSK" w:hAnsi="TH SarabunPSK" w:cs="TH SarabunPSK"/>
+          <w:cs/>
+        </w:rPr>
+        <w:t>ความสับสน (</w:t>
+      </w:r>
+      <w:r>
+        <w:rPr>
+          <w:rFonts w:ascii="TH SarabunPSK" w:hAnsi="TH SarabunPSK" w:cs="TH SarabunPSK"/>
+        </w:rPr>
+        <w:t xml:space="preserve">Confusion Matrix) </w:t>
+      </w:r>
+      <w:r>
+        <w:rPr>
+          <w:rFonts w:ascii="TH SarabunPSK" w:hAnsi="TH SarabunPSK" w:cs="TH SarabunPSK"/>
+          <w:cs/>
+        </w:rPr>
+        <w:t>และตัวชี้วัดมาตรฐานทางการแพทย์ (</w:t>
+      </w:r>
+      <w:r>
+        <w:rPr>
+          <w:rFonts w:ascii="TH SarabunPSK" w:hAnsi="TH SarabunPSK" w:cs="TH SarabunPSK"/>
+        </w:rPr>
+        <w:t xml:space="preserve">Fawcett, 2006; Saito &amp; </w:t>
+      </w:r>
+      <w:proofErr w:type="spellStart"/>
+      <w:r>
+        <w:rPr>
+          <w:rFonts w:ascii="TH SarabunPSK" w:hAnsi="TH SarabunPSK" w:cs="TH SarabunPSK"/>
+        </w:rPr>
+        <w:t>Rehmsmeier</w:t>
+      </w:r>
+      <w:proofErr w:type="spellEnd"/>
+      <w:r>
+        <w:rPr>
+          <w:rFonts w:ascii="TH SarabunPSK" w:hAnsi="TH SarabunPSK" w:cs="TH SarabunPSK"/>
+        </w:rPr>
+        <w:t xml:space="preserve">, 2015) </w:t>
+      </w:r>
+      <w:r>
+        <w:rPr>
+          <w:rFonts w:ascii="TH SarabunPSK" w:hAnsi="TH SarabunPSK" w:cs="TH SarabunPSK"/>
+          <w:cs/>
+        </w:rPr>
+        <w:t>ดัง</w:t>
+      </w:r>
+      <w:r>
+        <w:rPr>
           <w:rFonts w:ascii="TH SarabunPSK" w:hAnsi="TH SarabunPSK" w:cs="TH SarabunPSK" w:hint="cs"/>
+          <w:cs/>
+        </w:rPr>
+        <w:t>นี้</w:t>
+      </w:r>
+    </w:p>
+    <w:p>
+      <w:pPr>
+        <w:ind w:firstLine="720"/>
+        <w:jc w:val="both"/>
+        <w:rPr>
+          <w:rFonts w:ascii="TH SarabunPSK" w:hAnsi="TH SarabunPSK" w:cs="TH SarabunPSK"/>
         </w:rPr>
       </w:pPr>
-      <w:proofErr w:type="spellStart"/>
-      <w:r>
+      <w:r>
+        <w:rPr>
+          <w:rFonts w:ascii="TH SarabunPSK" w:hAnsi="TH SarabunPSK" w:cs="TH SarabunPSK"/>
+        </w:rPr>
+        <w:t>Accuracy (</w:t>
+      </w:r>
+      <w:r>
+        <w:rPr>
+          <w:rFonts w:ascii="TH SarabunPSK" w:hAnsi="TH SarabunPSK" w:cs="TH SarabunPSK"/>
+          <w:cs/>
+        </w:rPr>
+        <w:t>ความแม่นยำโดยรวม):</w:t>
+      </w:r>
+      <w:r>
+        <w:rPr>
+          <w:rFonts w:ascii="TH SarabunPSK" w:hAnsi="TH SarabunPSK" w:cs="TH SarabunPSK"/>
+        </w:rPr>
+        <w:t xml:space="preserve"> </w:t>
+      </w:r>
+      <w:r>
+        <w:rPr>
+          <w:rFonts w:ascii="TH SarabunPSK" w:hAnsi="TH SarabunPSK" w:cs="TH SarabunPSK"/>
+          <w:cs/>
+        </w:rPr>
+        <w:t>วัดสัดส่วนของภาพเอกซเรย์ที่แบบจำลองทำนายได้ถูกต้องทั้งหมด</w:t>
+      </w:r>
+      <w:r>
+        <w:rPr>
+          <w:rFonts w:ascii="TH SarabunPSK" w:hAnsi="TH SarabunPSK" w:cs="TH SarabunPSK"/>
+        </w:rPr>
+        <w:t xml:space="preserve"> (</w:t>
+      </w:r>
+      <w:r>
+        <w:rPr>
+          <w:rFonts w:ascii="TH SarabunPSK" w:hAnsi="TH SarabunPSK" w:cs="TH SarabunPSK"/>
+          <w:cs/>
+        </w:rPr>
+        <w:t>ทั้งกลุ่มที่พบโรคและไม่พบโรค)</w:t>
+      </w:r>
+      <w:r>
+        <w:rPr>
+          <w:rFonts w:ascii="TH SarabunPSK" w:hAnsi="TH SarabunPSK" w:cs="TH SarabunPSK"/>
+        </w:rPr>
+        <w:t xml:space="preserve"> </w:t>
+      </w:r>
+      <w:r>
+        <w:rPr>
+          <w:rFonts w:ascii="TH SarabunPSK" w:hAnsi="TH SarabunPSK" w:cs="TH SarabunPSK"/>
+          <w:cs/>
+        </w:rPr>
+        <w:t>เทียบกับจำนวนภาพทดสอบทั้งหมด</w:t>
+      </w:r>
+    </w:p>
+    <w:p>
+      <w:pPr>
+        <w:ind w:firstLine="720"/>
+        <w:jc w:val="both"/>
         <w:rPr>
           <w:rFonts w:ascii="TH SarabunPSK" w:hAnsi="TH SarabunPSK" w:cs="TH SarabunPSK" w:hint="cs"/>
-        </w:rPr>
-        <w:t>คำนวณค่าตัวชี้วัดมาตรฐานทางการแพทย์บนชุดข้อมูลทดสอบ</w:t>
-      </w:r>
-      <w:proofErr w:type="spellEnd"/>
-      <w:r>
-        <w:rPr>
-          <w:rFonts w:ascii="TH SarabunPSK" w:hAnsi="TH SarabunPSK" w:cs="TH SarabunPSK" w:hint="cs"/>
-        </w:rPr>
-        <w:t xml:space="preserve"> </w:t>
-      </w:r>
-      <w:proofErr w:type="spellStart"/>
-      <w:r>
-        <w:rPr>
-          <w:rFonts w:ascii="TH SarabunPSK" w:hAnsi="TH SarabunPSK" w:cs="TH SarabunPSK" w:hint="cs"/>
-        </w:rPr>
-        <w:t>ดังนี้</w:t>
-      </w:r>
-      <w:proofErr w:type="spellEnd"/>
+          <w:cs/>
+        </w:rPr>
+      </w:pPr>
     </w:p>
     <w:p>
       <w:pPr>
@@ -9517,6 +9598,69 @@
         <w:spacing w:before="60" w:after="60"/>
         <w:jc w:val="center"/>
       </w:pPr>
+    </w:p>
+    <w:p>
+      <w:pPr>
+        <w:spacing w:before="60" w:after="60"/>
+        <w:jc w:val="thaiDistribute"/>
+        <w:rPr>
+          <w:rFonts w:hint="cs"/>
+        </w:rPr>
+      </w:pPr>
+      <w:r>
+        <w:tab/>
+      </w:r>
+      <w:r>
+        <w:t>Precision (</w:t>
+      </w:r>
+      <w:r>
+        <w:rPr>
+          <w:cs/>
+        </w:rPr>
+        <w:t xml:space="preserve">ความเที่ยงตรง หรือ </w:t>
+      </w:r>
+      <w:r>
+        <w:t xml:space="preserve">Positive Predictive Value): </w:t>
+      </w:r>
+      <w:r>
+        <w:rPr>
+          <w:cs/>
+        </w:rPr>
+        <w:t>วัดสัดส่วนของภาพที่เป็นภาวะ</w:t>
+      </w:r>
+      <w:r>
+        <w:t xml:space="preserve"> Infiltration </w:t>
+      </w:r>
+      <w:r>
+        <w:rPr>
+          <w:cs/>
+        </w:rPr>
+        <w:t>จริง</w:t>
+      </w:r>
+      <w:r>
+        <w:t xml:space="preserve"> </w:t>
+      </w:r>
+      <w:r>
+        <w:rPr>
+          <w:cs/>
+        </w:rPr>
+        <w:t>จากจำนวนภาพทั้งหมดที่แบบจำลองทำนายว่าเป็น</w:t>
+      </w:r>
+      <w:r>
+        <w:t xml:space="preserve"> Infiltration </w:t>
+      </w:r>
+      <w:r>
+        <w:rPr>
+          <w:cs/>
+        </w:rPr>
+        <w:t>เพื่อประเมินความน่าเชื่อถือเมื่อแบบจำลองแจ้งเตือนว่าพบโรค</w:t>
+      </w:r>
+    </w:p>
+    <w:p>
+      <w:pPr>
+        <w:spacing w:before="60" w:after="60"/>
+        <w:jc w:val="center"/>
+      </w:pPr>
       <m:oMathPara>
         <m:oMath>
           <m:r>
@@ -9550,11 +9694,88 @@
               </m:r>
             </m:den>
           </m:f>
+        </m:oMath>
+      </m:oMathPara>
+    </w:p>
+    <w:p>
+      <w:pPr>
+        <w:spacing w:before="60" w:after="60"/>
+        <w:jc w:val="thaiDistribute"/>
+      </w:pPr>
+    </w:p>
+    <w:p>
+      <w:pPr>
+        <w:spacing w:before="60" w:after="60"/>
+        <w:jc w:val="thaiDistribute"/>
+      </w:pPr>
+      <w:r>
+        <w:rPr>
+          <w:b/>
+          <w:bCs/>
+        </w:rPr>
+        <w:tab/>
+      </w:r>
+      <w:r>
+        <w:t xml:space="preserve">Sensitivity </w:t>
+      </w:r>
+      <w:r>
+        <w:rPr>
+          <w:cs/>
+        </w:rPr>
+        <w:t xml:space="preserve">หรือ </w:t>
+      </w:r>
+      <w:r>
+        <w:t>Recall (</w:t>
+      </w:r>
+      <w:r>
+        <w:rPr>
+          <w:cs/>
+        </w:rPr>
+        <w:t xml:space="preserve">ความไว หรือ </w:t>
+      </w:r>
+      <w:r>
+        <w:t xml:space="preserve">True Positive Rate: TPR): </w:t>
+      </w:r>
+      <w:r>
+        <w:rPr>
+          <w:cs/>
+        </w:rPr>
+        <w:t>วัดความสามารถของแบบจำลองในการตรวจจับผู้ป่วยที่มีภาวะ</w:t>
+      </w:r>
+      <w:r>
+        <w:t xml:space="preserve"> Infiltration </w:t>
+      </w:r>
+      <w:r>
+        <w:rPr>
+          <w:cs/>
+        </w:rPr>
+        <w:t>จริงได้ครบถ้วนเพียงใด</w:t>
+      </w:r>
+      <w:r>
+        <w:t xml:space="preserve"> </w:t>
+      </w:r>
+      <w:r>
+        <w:rPr>
+          <w:cs/>
+        </w:rPr>
+        <w:t>ซึ่งเป็นตัวชี้วัดสำคัญในการคัดกรองทางการแพทย์เพื่อลดโอกาสการวินิจฉัยตกหล่น</w:t>
+      </w:r>
+      <w:r>
+        <w:t xml:space="preserve"> (False Negative)</w:t>
+      </w:r>
+    </w:p>
+    <w:p>
+      <w:pPr>
+        <w:spacing w:before="60" w:after="60"/>
+        <w:jc w:val="center"/>
+      </w:pPr>
+      <m:oMathPara>
+        <m:oMath>
           <m:r>
             <w:rPr>
               <w:rFonts w:ascii="Cambria Math" w:hAnsi="Cambria Math"/>
             </w:rPr>
-            <m:t xml:space="preserve">        Sensitivity (Recall) = </m:t>
+            <m:t xml:space="preserve">Sensitivity (Recall) = </m:t>
           </m:r>
           <m:f>
             <m:fPr>
@@ -9583,6 +9804,59 @@
           </m:f>
         </m:oMath>
       </m:oMathPara>
+    </w:p>
+    <w:p>
+      <w:pPr>
+        <w:spacing w:before="60" w:after="60"/>
+      </w:pPr>
+      <w:r>
+        <w:tab/>
+      </w:r>
+    </w:p>
+    <w:p>
+      <w:r>
+        <w:br w:type="page"/>
+      </w:r>
+    </w:p>
+    <w:p>
+      <w:pPr>
+        <w:spacing w:before="60" w:after="60"/>
+        <w:jc w:val="thaiDistribute"/>
+      </w:pPr>
+      <w:r>
+        <w:lastRenderedPageBreak/>
+        <w:tab/>
+      </w:r>
+      <w:r>
+        <w:t>Specificity (</w:t>
+      </w:r>
+      <w:r>
+        <w:rPr>
+          <w:cs/>
+        </w:rPr>
+        <w:t xml:space="preserve">ความจำเพาะ หรือ </w:t>
+      </w:r>
+      <w:r>
+        <w:t xml:space="preserve">True Negative Rate: TNR): </w:t>
+      </w:r>
+      <w:r>
+        <w:rPr>
+          <w:cs/>
+        </w:rPr>
+        <w:t>วัดความสามารถของแบบจำลองในการระบุภาพปอดปกติ (</w:t>
+      </w:r>
+      <w:r>
+        <w:t xml:space="preserve">No Finding) </w:t>
+      </w:r>
+      <w:r>
+        <w:rPr>
+          <w:cs/>
+        </w:rPr>
+        <w:t>ได้อย่างถูกต้อง เพื่อประเมินว่าแบบจำลองไม่ทำนายผลบวกลวง (</w:t>
+      </w:r>
+      <w:r>
+        <w:t>False Positive)</w:t>
+      </w:r>
     </w:p>
     <w:p>
       <w:pPr>
@@ -9628,6 +9902,88 @@
     <w:p>
       <w:pPr>
         <w:spacing w:before="60" w:after="60"/>
+        <w:jc w:val="thaiDistribute"/>
+      </w:pPr>
+    </w:p>
+    <w:p>
+      <w:pPr>
+        <w:spacing w:before="60" w:after="60"/>
+        <w:jc w:val="thaiDistribute"/>
+      </w:pPr>
+      <w:r>
+        <w:tab/>
+      </w:r>
+      <w:r>
+        <w:t xml:space="preserve">F1-Score: </w:t>
+      </w:r>
+      <w:r>
+        <w:rPr>
+          <w:cs/>
+        </w:rPr>
+        <w:t>ค่าเฉลี่ยฮา</w:t>
+      </w:r>
+      <w:proofErr w:type="spellStart"/>
+      <w:r>
+        <w:rPr>
+          <w:cs/>
+        </w:rPr>
+        <w:t>ร์</w:t>
+      </w:r>
+      <w:proofErr w:type="spellEnd"/>
+      <w:r>
+        <w:rPr>
+          <w:cs/>
+        </w:rPr>
+        <w:t>มอ</w:t>
+      </w:r>
+      <w:proofErr w:type="spellStart"/>
+      <w:r>
+        <w:rPr>
+          <w:cs/>
+        </w:rPr>
+        <w:t>นิก</w:t>
+      </w:r>
+      <w:proofErr w:type="spellEnd"/>
+      <w:r>
+        <w:t xml:space="preserve"> (Harmonic Mean) </w:t>
+      </w:r>
+      <w:r>
+        <w:rPr>
+          <w:cs/>
+        </w:rPr>
+        <w:t>ระหว่าง</w:t>
+      </w:r>
+      <w:r>
+        <w:t xml:space="preserve"> Precision </w:t>
+      </w:r>
+      <w:r>
+        <w:rPr>
+          <w:cs/>
+        </w:rPr>
+        <w:t>และ</w:t>
+      </w:r>
+      <w:r>
+        <w:t xml:space="preserve"> Recall </w:t>
+      </w:r>
+      <w:r>
+        <w:rPr>
+          <w:cs/>
+        </w:rPr>
+        <w:t>เพื่อวัดความสมดุลของประสิทธิภาพการจำแนกโรค</w:t>
+      </w:r>
+      <w:r>
+        <w:t xml:space="preserve"> </w:t>
+      </w:r>
+      <w:r>
+        <w:rPr>
+          <w:cs/>
+        </w:rPr>
+        <w:t>โดยลดความเอนเอียงในกรณีที่แบบจำลองทำนายเอนไปทางคลาสใดคลาสหนึ่ง</w:t>
+      </w:r>
+    </w:p>
+    <w:p>
+      <w:pPr>
+        <w:spacing w:before="60" w:after="60"/>
         <w:jc w:val="center"/>
       </w:pPr>
       <m:oMathPara>
@@ -9668,62 +10024,922 @@
     </w:p>
     <w:p>
       <w:pPr>
-        <w:ind w:firstLine="720"/>
-        <w:jc w:val="both"/>
+        <w:spacing w:before="60" w:after="60"/>
+        <w:jc w:val="center"/>
       </w:pPr>
-      <w:r>
-        <w:rPr>
-          <w:cs/>
-        </w:rPr>
-        <w:t xml:space="preserve">นอกจากนี้ยังวัดพื้นที่ใต้เส้นโค้ง </w:t>
-      </w:r>
-      <w:r>
-        <w:t xml:space="preserve">ROC (ROC-AUC) </w:t>
-      </w:r>
-      <w:r>
-        <w:rPr>
-          <w:cs/>
-        </w:rPr>
-        <w:t xml:space="preserve">และพื้นที่ใต้เส้นโค้ง </w:t>
-      </w:r>
-      <w:r>
-        <w:t xml:space="preserve">Precision–Recall (PR-AUC) </w:t>
-      </w:r>
-      <w:r>
-        <w:rPr>
-          <w:cs/>
-        </w:rPr>
-        <w:t xml:space="preserve">ซึ่งไม่ขึ้นกับเกณฑ์ตัดสินใจ สำหรับการทดลองที่ </w:t>
-      </w:r>
-      <w:r>
-        <w:t xml:space="preserve">2 </w:t>
-      </w:r>
-      <w:r>
-        <w:rPr>
-          <w:cs/>
-        </w:rPr>
-        <w:t xml:space="preserve">รายงานค่าเฉลี่ยแบบ </w:t>
-      </w:r>
-      <w:r>
-        <w:t xml:space="preserve">Macro-average </w:t>
-      </w:r>
-      <w:r>
-        <w:rPr>
-          <w:cs/>
-        </w:rPr>
-        <w:t xml:space="preserve">ของทั้ง </w:t>
-      </w:r>
-      <w:r>
-        <w:t xml:space="preserve">16 </w:t>
-      </w:r>
-      <w:r>
-        <w:rPr>
-          <w:cs/>
-        </w:rPr>
-        <w:t xml:space="preserve">สภาวะ พร้อมทั้งนำเสนอผลในรูปแบบ </w:t>
-      </w:r>
-      <w:r>
-        <w:t>Confusion Matrix</w:t>
+    </w:p>
+    <w:p>
+      <w:pPr>
+        <w:keepNext/>
+        <w:spacing w:before="120"/>
+        <w:rPr>
+          <w:rFonts w:ascii="TH SarabunPSK" w:hAnsi="TH SarabunPSK" w:cs="TH SarabunPSK" w:hint="cs"/>
+        </w:rPr>
+      </w:pPr>
+      <w:r>
+        <w:rPr>
+          <w:rFonts w:ascii="TH SarabunPSK" w:hAnsi="TH SarabunPSK" w:cs="TH SarabunPSK"/>
+        </w:rPr>
+        <w:tab/>
+      </w:r>
+      <w:r>
+        <w:rPr>
+          <w:rFonts w:ascii="TH SarabunPSK" w:hAnsi="TH SarabunPSK" w:cs="TH SarabunPSK" w:hint="cs"/>
+        </w:rPr>
+        <w:t xml:space="preserve">ROC-AUC </w:t>
+      </w:r>
+      <w:r>
+        <w:rPr>
+          <w:rFonts w:ascii="TH SarabunPSK" w:hAnsi="TH SarabunPSK" w:cs="TH SarabunPSK" w:hint="cs"/>
+          <w:cs/>
+        </w:rPr>
+        <w:t xml:space="preserve">และ </w:t>
+      </w:r>
+      <w:r>
+        <w:rPr>
+          <w:rFonts w:ascii="TH SarabunPSK" w:hAnsi="TH SarabunPSK" w:cs="TH SarabunPSK" w:hint="cs"/>
+        </w:rPr>
+        <w:t>PR-AUC (</w:t>
+      </w:r>
+      <w:r>
+        <w:rPr>
+          <w:rFonts w:ascii="TH SarabunPSK" w:hAnsi="TH SarabunPSK" w:cs="TH SarabunPSK" w:hint="cs"/>
+          <w:cs/>
+        </w:rPr>
+        <w:t>การประเมินแบบไม่ขึ้นกับเกณฑ์ตัดสินใจ):</w:t>
+      </w:r>
+    </w:p>
+    <w:p>
+      <w:pPr>
+        <w:keepNext/>
+        <w:spacing w:before="120"/>
+        <w:ind w:left="720" w:hanging="360"/>
+        <w:jc w:val="thaiDistribute"/>
+        <w:rPr>
+          <w:rFonts w:ascii="TH SarabunPSK" w:hAnsi="TH SarabunPSK" w:cs="TH SarabunPSK" w:hint="cs"/>
+        </w:rPr>
+      </w:pPr>
+      <w:r>
+        <w:rPr>
+          <w:rFonts w:ascii="TH SarabunPSK" w:hAnsi="TH SarabunPSK" w:cs="TH SarabunPSK"/>
+        </w:rPr>
+        <w:tab/>
+      </w:r>
+      <w:r>
+        <w:rPr>
+          <w:rFonts w:ascii="TH SarabunPSK" w:hAnsi="TH SarabunPSK" w:cs="TH SarabunPSK"/>
+        </w:rPr>
+        <w:tab/>
+      </w:r>
+      <w:r>
+        <w:rPr>
+          <w:rFonts w:ascii="TH SarabunPSK" w:hAnsi="TH SarabunPSK" w:cs="TH SarabunPSK" w:hint="cs"/>
+        </w:rPr>
+        <w:t xml:space="preserve">ROC-AUC (Area Under the Receiver Operating Characteristic Curve): </w:t>
+      </w:r>
+      <w:r>
+        <w:rPr>
+          <w:rFonts w:ascii="TH SarabunPSK" w:hAnsi="TH SarabunPSK" w:cs="TH SarabunPSK" w:hint="cs"/>
+          <w:cs/>
+        </w:rPr>
+        <w:t>วัดพื้นที่ใต้กราฟความสัมพันธ์ระหว่างอัตราผลบวกจริง</w:t>
+      </w:r>
+      <w:r>
+        <w:rPr>
+          <w:rFonts w:ascii="TH SarabunPSK" w:hAnsi="TH SarabunPSK" w:cs="TH SarabunPSK" w:hint="cs"/>
+        </w:rPr>
+        <w:t xml:space="preserve"> (</w:t>
+      </w:r>
+      <m:oMath>
+        <m:r>
+          <m:rPr>
+            <m:nor/>
+          </m:rPr>
+          <w:rPr>
+            <w:rFonts w:ascii="TH SarabunPSK" w:hAnsi="TH SarabunPSK" w:cs="TH SarabunPSK" w:hint="cs"/>
+          </w:rPr>
+          <m:t>TPR</m:t>
+        </m:r>
+        <m:r>
+          <w:rPr>
+            <w:rFonts w:ascii="Cambria Math" w:hAnsi="Cambria Math" w:cs="TH SarabunPSK" w:hint="cs"/>
+          </w:rPr>
+          <m:t>=</m:t>
+        </m:r>
+        <m:r>
+          <m:rPr>
+            <m:nor/>
+          </m:rPr>
+          <w:rPr>
+            <w:rFonts w:ascii="TH SarabunPSK" w:hAnsi="TH SarabunPSK" w:cs="TH SarabunPSK" w:hint="cs"/>
+          </w:rPr>
+          <m:t>Sensitivity</m:t>
+        </m:r>
+      </m:oMath>
+      <w:r>
+        <w:rPr>
+          <w:rFonts w:ascii="TH SarabunPSK" w:hAnsi="TH SarabunPSK" w:cs="TH SarabunPSK" w:hint="cs"/>
+        </w:rPr>
+        <w:t xml:space="preserve">) </w:t>
+      </w:r>
+      <w:r>
+        <w:rPr>
+          <w:rFonts w:ascii="TH SarabunPSK" w:hAnsi="TH SarabunPSK" w:cs="TH SarabunPSK" w:hint="cs"/>
+          <w:cs/>
+        </w:rPr>
+        <w:t>และอัตราผลบวกลวง</w:t>
+      </w:r>
+      <w:r>
+        <w:rPr>
+          <w:rFonts w:ascii="TH SarabunPSK" w:hAnsi="TH SarabunPSK" w:cs="TH SarabunPSK" w:hint="cs"/>
+        </w:rPr>
+        <w:t xml:space="preserve"> </w:t>
+      </w:r>
+      <w:r>
+        <w:rPr>
+          <w:rFonts w:ascii="TH SarabunPSK" w:hAnsi="TH SarabunPSK" w:cs="TH SarabunPSK"/>
+        </w:rPr>
+        <w:t>(</w:t>
+      </w:r>
+      <w:r>
+        <w:rPr>
+          <w:rFonts w:ascii="TH SarabunPSK" w:hAnsi="TH SarabunPSK" w:cs="TH SarabunPSK"/>
+        </w:rPr>
+        <w:t>FPR</w:t>
+      </w:r>
+      <w:r>
+        <w:rPr>
+          <w:rFonts w:ascii="TH SarabunPSK" w:hAnsi="TH SarabunPSK" w:cs="TH SarabunPSK"/>
+        </w:rPr>
+        <w:t xml:space="preserve"> </w:t>
+      </w:r>
+      <w:r>
+        <w:rPr>
+          <w:rFonts w:ascii="TH SarabunPSK" w:hAnsi="TH SarabunPSK" w:cs="TH SarabunPSK"/>
+        </w:rPr>
+        <w:t>=</w:t>
+      </w:r>
+      <w:r>
+        <w:rPr>
+          <w:rFonts w:ascii="TH SarabunPSK" w:hAnsi="TH SarabunPSK" w:cs="TH SarabunPSK"/>
+        </w:rPr>
+        <w:t xml:space="preserve"> </w:t>
+      </w:r>
+      <w:r>
+        <w:rPr>
+          <w:rFonts w:ascii="TH SarabunPSK" w:hAnsi="TH SarabunPSK" w:cs="TH SarabunPSK"/>
+        </w:rPr>
+        <w:t>1</w:t>
+      </w:r>
+      <w:r>
+        <w:rPr>
+          <w:rFonts w:ascii="TH SarabunPSK" w:hAnsi="TH SarabunPSK" w:cs="TH SarabunPSK"/>
+        </w:rPr>
+        <w:t xml:space="preserve"> </w:t>
+      </w:r>
+      <w:r>
+        <w:rPr>
+          <w:rFonts w:ascii="TH SarabunPSK" w:hAnsi="TH SarabunPSK" w:cs="TH SarabunPSK"/>
+        </w:rPr>
+        <w:t>-Specificity)</w:t>
+      </w:r>
+      <w:r>
+        <w:rPr>
+          <w:rFonts w:ascii="TH SarabunPSK" w:hAnsi="TH SarabunPSK" w:cs="TH SarabunPSK"/>
+        </w:rPr>
+        <w:t xml:space="preserve"> </w:t>
+      </w:r>
+      <w:r>
+        <w:rPr>
+          <w:rFonts w:ascii="TH SarabunPSK" w:hAnsi="TH SarabunPSK" w:cs="TH SarabunPSK" w:hint="cs"/>
+          <w:cs/>
+        </w:rPr>
+        <w:t>เมื่อแปรผันค่าระดับเกณฑ์ตัดสินใจ</w:t>
+      </w:r>
+      <w:r>
+        <w:rPr>
+          <w:rFonts w:ascii="TH SarabunPSK" w:hAnsi="TH SarabunPSK" w:cs="TH SarabunPSK" w:hint="cs"/>
+        </w:rPr>
+        <w:t xml:space="preserve"> (Classification Threshold) </w:t>
+      </w:r>
+      <w:r>
+        <w:rPr>
+          <w:rFonts w:ascii="TH SarabunPSK" w:hAnsi="TH SarabunPSK" w:cs="TH SarabunPSK" w:hint="cs"/>
+          <w:cs/>
+        </w:rPr>
+        <w:t>ทุกค่าที่เป็นไปได้</w:t>
+      </w:r>
+      <w:r>
+        <w:rPr>
+          <w:rFonts w:ascii="TH SarabunPSK" w:hAnsi="TH SarabunPSK" w:cs="TH SarabunPSK" w:hint="cs"/>
+        </w:rPr>
+        <w:t xml:space="preserve"> </w:t>
+      </w:r>
+      <w:r>
+        <w:rPr>
+          <w:rFonts w:ascii="TH SarabunPSK" w:hAnsi="TH SarabunPSK" w:cs="TH SarabunPSK" w:hint="cs"/>
+          <w:cs/>
+        </w:rPr>
+        <w:t>มีค่าอยู่ในช่วง</w:t>
+      </w:r>
+      <w:r>
+        <w:rPr>
+          <w:rFonts w:ascii="TH SarabunPSK" w:hAnsi="TH SarabunPSK" w:cs="TH SarabunPSK" w:hint="cs"/>
+        </w:rPr>
+        <w:t xml:space="preserve"> </w:t>
+      </w:r>
+      <w:r>
+        <w:rPr>
+          <w:rFonts w:ascii="TH SarabunPSK" w:hAnsi="TH SarabunPSK" w:cs="TH SarabunPSK"/>
+        </w:rPr>
+        <w:t xml:space="preserve">0 </w:t>
+      </w:r>
+      <w:r>
+        <w:rPr>
+          <w:rFonts w:ascii="TH SarabunPSK" w:hAnsi="TH SarabunPSK" w:cs="TH SarabunPSK" w:hint="cs"/>
+          <w:cs/>
+        </w:rPr>
+        <w:t>ถึง</w:t>
+      </w:r>
+      <w:r>
+        <w:rPr>
+          <w:rFonts w:ascii="TH SarabunPSK" w:hAnsi="TH SarabunPSK" w:cs="TH SarabunPSK" w:hint="cs"/>
+        </w:rPr>
+        <w:t xml:space="preserve"> </w:t>
+      </w:r>
+      <w:r>
+        <w:rPr>
+          <w:rFonts w:ascii="TH SarabunPSK" w:hAnsi="TH SarabunPSK" w:cs="TH SarabunPSK"/>
+        </w:rPr>
+        <w:t>1</w:t>
+      </w:r>
+      <w:r>
+        <w:rPr>
+          <w:rFonts w:ascii="TH SarabunPSK" w:hAnsi="TH SarabunPSK" w:cs="TH SarabunPSK" w:hint="cs"/>
+          <w:cs/>
+        </w:rPr>
+        <w:t>โดยค่าเข้าใกล้</w:t>
+      </w:r>
+      <w:r>
+        <w:rPr>
+          <w:rFonts w:ascii="TH SarabunPSK" w:hAnsi="TH SarabunPSK" w:cs="TH SarabunPSK" w:hint="cs"/>
+        </w:rPr>
+        <w:t xml:space="preserve"> </w:t>
+      </w:r>
+      <w:r>
+        <w:rPr>
+          <w:rFonts w:ascii="TH SarabunPSK" w:hAnsi="TH SarabunPSK" w:cs="TH SarabunPSK"/>
+        </w:rPr>
+        <w:t xml:space="preserve">1.0 </w:t>
+      </w:r>
+      <w:r>
+        <w:rPr>
+          <w:rFonts w:ascii="TH SarabunPSK" w:hAnsi="TH SarabunPSK" w:cs="TH SarabunPSK" w:hint="cs"/>
+          <w:cs/>
+        </w:rPr>
+        <w:t>หมายถึงแบบจำลองมีความสามารถในการแยกแยะระหว่างคลาส</w:t>
+      </w:r>
+      <w:r>
+        <w:rPr>
+          <w:rFonts w:ascii="TH SarabunPSK" w:hAnsi="TH SarabunPSK" w:cs="TH SarabunPSK" w:hint="cs"/>
+        </w:rPr>
+        <w:t xml:space="preserve"> Infiltration </w:t>
+      </w:r>
+      <w:r>
+        <w:rPr>
+          <w:rFonts w:ascii="TH SarabunPSK" w:hAnsi="TH SarabunPSK" w:cs="TH SarabunPSK" w:hint="cs"/>
+          <w:cs/>
+        </w:rPr>
+        <w:t>และ</w:t>
+      </w:r>
+      <w:r>
+        <w:rPr>
+          <w:rFonts w:ascii="TH SarabunPSK" w:hAnsi="TH SarabunPSK" w:cs="TH SarabunPSK" w:hint="cs"/>
+        </w:rPr>
+        <w:t xml:space="preserve"> No Finding </w:t>
+      </w:r>
+      <w:r>
+        <w:rPr>
+          <w:rFonts w:ascii="TH SarabunPSK" w:hAnsi="TH SarabunPSK" w:cs="TH SarabunPSK" w:hint="cs"/>
+          <w:cs/>
+        </w:rPr>
+        <w:t>ได้ดีเยี่ยม</w:t>
+      </w:r>
+      <w:r>
+        <w:rPr>
+          <w:rFonts w:ascii="TH SarabunPSK" w:hAnsi="TH SarabunPSK" w:cs="TH SarabunPSK" w:hint="cs"/>
+        </w:rPr>
+        <w:t xml:space="preserve"> </w:t>
+      </w:r>
+      <w:r>
+        <w:rPr>
+          <w:rFonts w:ascii="TH SarabunPSK" w:hAnsi="TH SarabunPSK" w:cs="TH SarabunPSK" w:hint="cs"/>
+          <w:cs/>
+        </w:rPr>
+        <w:t>ส่วนค่า</w:t>
+      </w:r>
+      <w:r>
+        <w:rPr>
+          <w:rFonts w:ascii="TH SarabunPSK" w:hAnsi="TH SarabunPSK" w:cs="TH SarabunPSK" w:hint="cs"/>
+        </w:rPr>
+        <w:t xml:space="preserve"> </w:t>
+      </w:r>
+      <w:r>
+        <w:rPr>
+          <w:rFonts w:ascii="TH SarabunPSK" w:hAnsi="TH SarabunPSK" w:cs="TH SarabunPSK"/>
+        </w:rPr>
+        <w:t xml:space="preserve">0.5 </w:t>
+      </w:r>
+      <w:r>
+        <w:rPr>
+          <w:rFonts w:ascii="TH SarabunPSK" w:hAnsi="TH SarabunPSK" w:cs="TH SarabunPSK" w:hint="cs"/>
+          <w:cs/>
+        </w:rPr>
+        <w:t>เทียบเท่ากับการทายแบบสุ่ม</w:t>
+      </w:r>
+      <w:r>
+        <w:rPr>
+          <w:rFonts w:ascii="TH SarabunPSK" w:hAnsi="TH SarabunPSK" w:cs="TH SarabunPSK" w:hint="cs"/>
+        </w:rPr>
+        <w:t xml:space="preserve"> (Fawcett, 2006)</w:t>
+      </w:r>
+    </w:p>
+    <w:p>
+      <w:pPr>
+        <w:keepNext/>
+        <w:spacing w:before="120"/>
+        <w:ind w:left="720" w:hanging="360"/>
+        <w:jc w:val="thaiDistribute"/>
+        <w:rPr>
+          <w:rFonts w:ascii="TH SarabunPSK" w:hAnsi="TH SarabunPSK" w:cs="TH SarabunPSK" w:hint="cs"/>
+        </w:rPr>
+      </w:pPr>
+      <w:r>
+        <w:rPr>
+          <w:rFonts w:ascii="TH SarabunPSK" w:hAnsi="TH SarabunPSK" w:cs="TH SarabunPSK"/>
+        </w:rPr>
+        <w:tab/>
+      </w:r>
+      <w:r>
+        <w:rPr>
+          <w:rFonts w:ascii="TH SarabunPSK" w:hAnsi="TH SarabunPSK" w:cs="TH SarabunPSK"/>
+        </w:rPr>
+        <w:tab/>
+      </w:r>
+      <w:r>
+        <w:rPr>
+          <w:rFonts w:ascii="TH SarabunPSK" w:hAnsi="TH SarabunPSK" w:cs="TH SarabunPSK" w:hint="cs"/>
+        </w:rPr>
+        <w:t xml:space="preserve">PR-AUC (Area Under the Precision–Recall Curve): </w:t>
+      </w:r>
+      <w:r>
+        <w:rPr>
+          <w:rFonts w:ascii="TH SarabunPSK" w:hAnsi="TH SarabunPSK" w:cs="TH SarabunPSK" w:hint="cs"/>
+          <w:cs/>
+        </w:rPr>
+        <w:t>วัดพื้นที่ใต้กราฟความสัมพันธ์ระหว่าง</w:t>
+      </w:r>
+      <w:r>
+        <w:rPr>
+          <w:rFonts w:ascii="TH SarabunPSK" w:hAnsi="TH SarabunPSK" w:cs="TH SarabunPSK" w:hint="cs"/>
+        </w:rPr>
+        <w:t xml:space="preserve"> Precision </w:t>
+      </w:r>
+      <w:r>
+        <w:rPr>
+          <w:rFonts w:ascii="TH SarabunPSK" w:hAnsi="TH SarabunPSK" w:cs="TH SarabunPSK" w:hint="cs"/>
+          <w:cs/>
+        </w:rPr>
+        <w:t>และ</w:t>
+      </w:r>
+      <w:r>
+        <w:rPr>
+          <w:rFonts w:ascii="TH SarabunPSK" w:hAnsi="TH SarabunPSK" w:cs="TH SarabunPSK" w:hint="cs"/>
+        </w:rPr>
+        <w:t xml:space="preserve"> Recall </w:t>
+      </w:r>
+      <w:r>
+        <w:rPr>
+          <w:rFonts w:ascii="TH SarabunPSK" w:hAnsi="TH SarabunPSK" w:cs="TH SarabunPSK" w:hint="cs"/>
+          <w:cs/>
+        </w:rPr>
+        <w:t>ในทุกระดับเกณฑ์ตัดสินใจ</w:t>
+      </w:r>
+      <w:r>
+        <w:rPr>
+          <w:rFonts w:ascii="TH SarabunPSK" w:hAnsi="TH SarabunPSK" w:cs="TH SarabunPSK" w:hint="cs"/>
+        </w:rPr>
+        <w:t xml:space="preserve"> </w:t>
+      </w:r>
+      <w:r>
+        <w:rPr>
+          <w:rFonts w:ascii="TH SarabunPSK" w:hAnsi="TH SarabunPSK" w:cs="TH SarabunPSK" w:hint="cs"/>
+          <w:cs/>
+        </w:rPr>
+        <w:t>ซึ่งสะท้อนประสิทธิภาพการตรวจจับคลาสเป้าหมาย</w:t>
+      </w:r>
+      <w:r>
+        <w:rPr>
+          <w:rFonts w:ascii="TH SarabunPSK" w:hAnsi="TH SarabunPSK" w:cs="TH SarabunPSK" w:hint="cs"/>
+        </w:rPr>
+        <w:t xml:space="preserve"> (Infiltration) </w:t>
+      </w:r>
+      <w:r>
+        <w:rPr>
+          <w:rFonts w:ascii="TH SarabunPSK" w:hAnsi="TH SarabunPSK" w:cs="TH SarabunPSK" w:hint="cs"/>
+          <w:cs/>
+        </w:rPr>
+        <w:t>ได้อย่างแม่นยำควบคู่กับ</w:t>
+      </w:r>
+      <w:r>
+        <w:rPr>
+          <w:rFonts w:ascii="TH SarabunPSK" w:hAnsi="TH SarabunPSK" w:cs="TH SarabunPSK" w:hint="cs"/>
+        </w:rPr>
+        <w:t xml:space="preserve"> ROC-AUC (Saito &amp; </w:t>
+      </w:r>
+      <w:proofErr w:type="spellStart"/>
+      <w:r>
+        <w:rPr>
+          <w:rFonts w:ascii="TH SarabunPSK" w:hAnsi="TH SarabunPSK" w:cs="TH SarabunPSK" w:hint="cs"/>
+        </w:rPr>
+        <w:t>Rehmsmeier</w:t>
+      </w:r>
+      <w:proofErr w:type="spellEnd"/>
+      <w:r>
+        <w:rPr>
+          <w:rFonts w:ascii="TH SarabunPSK" w:hAnsi="TH SarabunPSK" w:cs="TH SarabunPSK" w:hint="cs"/>
+        </w:rPr>
+        <w:t>, 2015)</w:t>
+      </w:r>
+    </w:p>
+    <w:p>
+      <w:pPr>
+        <w:keepNext/>
+        <w:spacing w:before="120"/>
+        <w:ind w:left="360"/>
+        <w:rPr>
+          <w:rFonts w:ascii="TH SarabunPSK" w:hAnsi="TH SarabunPSK" w:cs="TH SarabunPSK" w:hint="cs"/>
+        </w:rPr>
+      </w:pPr>
+      <w:r>
+        <w:rPr>
+          <w:rFonts w:ascii="TH SarabunPSK" w:hAnsi="TH SarabunPSK" w:cs="TH SarabunPSK" w:hint="cs"/>
+          <w:cs/>
+        </w:rPr>
+        <w:t>นิยามตัวแปร:</w:t>
+      </w:r>
+      <w:r>
+        <w:rPr>
+          <w:rFonts w:ascii="TH SarabunPSK" w:hAnsi="TH SarabunPSK" w:cs="TH SarabunPSK" w:hint="cs"/>
+        </w:rPr>
+        <w:t xml:space="preserve"> </w:t>
+      </w:r>
+      <w:r>
+        <w:rPr>
+          <w:rFonts w:ascii="TH SarabunPSK" w:hAnsi="TH SarabunPSK" w:cs="TH SarabunPSK" w:hint="cs"/>
+          <w:cs/>
+        </w:rPr>
+        <w:t>กำหนดให้คลาสเป้าหมาย</w:t>
+      </w:r>
+      <w:r>
+        <w:rPr>
+          <w:rFonts w:ascii="TH SarabunPSK" w:hAnsi="TH SarabunPSK" w:cs="TH SarabunPSK" w:hint="cs"/>
+        </w:rPr>
+        <w:t xml:space="preserve"> (Positive Class) </w:t>
+      </w:r>
+      <w:r>
+        <w:rPr>
+          <w:rFonts w:ascii="TH SarabunPSK" w:hAnsi="TH SarabunPSK" w:cs="TH SarabunPSK" w:hint="cs"/>
+          <w:cs/>
+        </w:rPr>
+        <w:t>คือภาพที่มีภาวะปอดอักเสบแทรกซึม</w:t>
+      </w:r>
+      <w:r>
+        <w:rPr>
+          <w:rFonts w:ascii="TH SarabunPSK" w:hAnsi="TH SarabunPSK" w:cs="TH SarabunPSK" w:hint="cs"/>
+        </w:rPr>
+        <w:t xml:space="preserve"> (Infiltration) </w:t>
+      </w:r>
+      <w:r>
+        <w:rPr>
+          <w:rFonts w:ascii="TH SarabunPSK" w:hAnsi="TH SarabunPSK" w:cs="TH SarabunPSK" w:hint="cs"/>
+          <w:cs/>
+        </w:rPr>
+        <w:t>และคลาสปกติ</w:t>
+      </w:r>
+      <w:r>
+        <w:rPr>
+          <w:rFonts w:ascii="TH SarabunPSK" w:hAnsi="TH SarabunPSK" w:cs="TH SarabunPSK" w:hint="cs"/>
+        </w:rPr>
+        <w:t xml:space="preserve"> (Negative Class) </w:t>
+      </w:r>
+      <w:r>
+        <w:rPr>
+          <w:rFonts w:ascii="TH SarabunPSK" w:hAnsi="TH SarabunPSK" w:cs="TH SarabunPSK" w:hint="cs"/>
+          <w:cs/>
+        </w:rPr>
+        <w:t>คือภาพที่ไม่พบความผิดปกติ</w:t>
+      </w:r>
+      <w:r>
+        <w:rPr>
+          <w:rFonts w:ascii="TH SarabunPSK" w:hAnsi="TH SarabunPSK" w:cs="TH SarabunPSK" w:hint="cs"/>
+        </w:rPr>
+        <w:t xml:space="preserve"> (No Finding) </w:t>
+      </w:r>
+      <w:r>
+        <w:rPr>
+          <w:rFonts w:ascii="TH SarabunPSK" w:hAnsi="TH SarabunPSK" w:cs="TH SarabunPSK" w:hint="cs"/>
+          <w:cs/>
+        </w:rPr>
+        <w:t>โดยที่:</w:t>
+      </w:r>
+    </w:p>
+    <w:p>
+      <w:pPr>
+        <w:keepNext/>
+        <w:spacing w:before="120"/>
+        <w:ind w:left="360"/>
+        <w:rPr>
+          <w:rFonts w:ascii="TH SarabunPSK" w:hAnsi="TH SarabunPSK" w:cs="TH SarabunPSK" w:hint="cs"/>
+        </w:rPr>
+      </w:pPr>
+      <w:r>
+        <w:rPr>
+          <w:rFonts w:ascii="TH SarabunPSK" w:hAnsi="TH SarabunPSK" w:cs="TH SarabunPSK"/>
+        </w:rPr>
+        <w:tab/>
+      </w:r>
+      <m:oMath>
+        <m:r>
+          <w:rPr>
+            <w:rFonts w:ascii="Cambria Math" w:hAnsi="Cambria Math" w:cs="TH SarabunPSK" w:hint="cs"/>
+          </w:rPr>
+          <m:t>TP</m:t>
+        </m:r>
+      </m:oMath>
+      <w:r>
+        <w:rPr>
+          <w:rFonts w:ascii="TH SarabunPSK" w:hAnsi="TH SarabunPSK" w:cs="TH SarabunPSK" w:hint="cs"/>
+        </w:rPr>
+        <w:t>(True Posit</w:t>
+      </w:r>
+      <w:proofErr w:type="spellStart"/>
+      <w:r>
+        <w:rPr>
+          <w:rFonts w:ascii="TH SarabunPSK" w:hAnsi="TH SarabunPSK" w:cs="TH SarabunPSK" w:hint="cs"/>
+        </w:rPr>
+        <w:t>ive</w:t>
+      </w:r>
+      <w:proofErr w:type="spellEnd"/>
+      <w:r>
+        <w:rPr>
+          <w:rFonts w:ascii="TH SarabunPSK" w:hAnsi="TH SarabunPSK" w:cs="TH SarabunPSK" w:hint="cs"/>
+        </w:rPr>
+        <w:t xml:space="preserve">): </w:t>
+      </w:r>
+      <w:r>
+        <w:rPr>
+          <w:rFonts w:ascii="TH SarabunPSK" w:hAnsi="TH SarabunPSK" w:cs="TH SarabunPSK" w:hint="cs"/>
+          <w:cs/>
+        </w:rPr>
+        <w:t>จำนวนภาพที่มีภาวะ</w:t>
+      </w:r>
+      <w:r>
+        <w:rPr>
+          <w:rFonts w:ascii="TH SarabunPSK" w:hAnsi="TH SarabunPSK" w:cs="TH SarabunPSK" w:hint="cs"/>
+        </w:rPr>
+        <w:t xml:space="preserve"> Infiltration </w:t>
+      </w:r>
+      <w:r>
+        <w:rPr>
+          <w:rFonts w:ascii="TH SarabunPSK" w:hAnsi="TH SarabunPSK" w:cs="TH SarabunPSK" w:hint="cs"/>
+          <w:cs/>
+        </w:rPr>
+        <w:t>จริง</w:t>
+      </w:r>
+      <w:r>
+        <w:rPr>
+          <w:rFonts w:ascii="TH SarabunPSK" w:hAnsi="TH SarabunPSK" w:cs="TH SarabunPSK" w:hint="cs"/>
+        </w:rPr>
+        <w:t xml:space="preserve"> </w:t>
+      </w:r>
+      <w:r>
+        <w:rPr>
+          <w:rFonts w:ascii="TH SarabunPSK" w:hAnsi="TH SarabunPSK" w:cs="TH SarabunPSK" w:hint="cs"/>
+          <w:cs/>
+        </w:rPr>
+        <w:t>และแบบจำลองทำนายถูกต้องว่าเป็น</w:t>
+      </w:r>
+      <w:r>
+        <w:rPr>
+          <w:rFonts w:ascii="TH SarabunPSK" w:hAnsi="TH SarabunPSK" w:cs="TH SarabunPSK" w:hint="cs"/>
+        </w:rPr>
+        <w:t xml:space="preserve"> Infiltration</w:t>
+      </w:r>
+    </w:p>
+    <w:p>
+      <w:pPr>
+        <w:keepNext/>
+        <w:spacing w:before="120"/>
+        <w:ind w:left="360"/>
+        <w:rPr>
+          <w:rFonts w:ascii="TH SarabunPSK" w:hAnsi="TH SarabunPSK" w:cs="TH SarabunPSK" w:hint="cs"/>
+        </w:rPr>
+      </w:pPr>
+      <w:r>
+        <w:rPr>
+          <w:rFonts w:ascii="TH SarabunPSK" w:hAnsi="TH SarabunPSK" w:cs="TH SarabunPSK"/>
+        </w:rPr>
+        <w:tab/>
+      </w:r>
+      <m:oMath>
+        <m:r>
+          <w:rPr>
+            <w:rFonts w:ascii="Cambria Math" w:hAnsi="Cambria Math" w:cs="TH SarabunPSK" w:hint="cs"/>
+          </w:rPr>
+          <m:t>TN</m:t>
+        </m:r>
+      </m:oMath>
+      <w:r>
+        <w:rPr>
+          <w:rFonts w:ascii="TH SarabunPSK" w:hAnsi="TH SarabunPSK" w:cs="TH SarabunPSK" w:hint="cs"/>
+        </w:rPr>
+        <w:t xml:space="preserve">(True Negative): </w:t>
+      </w:r>
+      <w:r>
+        <w:rPr>
+          <w:rFonts w:ascii="TH SarabunPSK" w:hAnsi="TH SarabunPSK" w:cs="TH SarabunPSK" w:hint="cs"/>
+          <w:cs/>
+        </w:rPr>
+        <w:t>จำนวนภาพที่เป็นปอดปกติ</w:t>
+      </w:r>
+      <w:r>
+        <w:rPr>
+          <w:rFonts w:ascii="TH SarabunPSK" w:hAnsi="TH SarabunPSK" w:cs="TH SarabunPSK" w:hint="cs"/>
+        </w:rPr>
+        <w:t xml:space="preserve"> (No Finding) </w:t>
+      </w:r>
+      <w:r>
+        <w:rPr>
+          <w:rFonts w:ascii="TH SarabunPSK" w:hAnsi="TH SarabunPSK" w:cs="TH SarabunPSK" w:hint="cs"/>
+          <w:cs/>
+        </w:rPr>
+        <w:t>จริง</w:t>
+      </w:r>
+      <w:r>
+        <w:rPr>
+          <w:rFonts w:ascii="TH SarabunPSK" w:hAnsi="TH SarabunPSK" w:cs="TH SarabunPSK" w:hint="cs"/>
+        </w:rPr>
+        <w:t xml:space="preserve"> </w:t>
+      </w:r>
+      <w:r>
+        <w:rPr>
+          <w:rFonts w:ascii="TH SarabunPSK" w:hAnsi="TH SarabunPSK" w:cs="TH SarabunPSK" w:hint="cs"/>
+          <w:cs/>
+        </w:rPr>
+        <w:t>และแบบจำลองทำนายถูกต้องว่าเป็น</w:t>
+      </w:r>
+      <w:r>
+        <w:rPr>
+          <w:rFonts w:ascii="TH SarabunPSK" w:hAnsi="TH SarabunPSK" w:cs="TH SarabunPSK" w:hint="cs"/>
+        </w:rPr>
+        <w:t xml:space="preserve"> No Finding</w:t>
+      </w:r>
+    </w:p>
+    <w:p>
+      <w:pPr>
+        <w:keepNext/>
+        <w:spacing w:before="120"/>
+        <w:ind w:left="360"/>
+        <w:rPr>
+          <w:rFonts w:ascii="TH SarabunPSK" w:hAnsi="TH SarabunPSK" w:cs="TH SarabunPSK" w:hint="cs"/>
+        </w:rPr>
+      </w:pPr>
+      <w:r>
+        <w:rPr>
+          <w:rFonts w:ascii="TH SarabunPSK" w:hAnsi="TH SarabunPSK" w:cs="TH SarabunPSK"/>
+        </w:rPr>
+        <w:tab/>
+      </w:r>
+      <m:oMath>
+        <m:r>
+          <w:rPr>
+            <w:rFonts w:ascii="Cambria Math" w:hAnsi="Cambria Math" w:cs="TH SarabunPSK" w:hint="cs"/>
+          </w:rPr>
+          <m:t>FP</m:t>
+        </m:r>
+      </m:oMath>
+      <w:r>
+        <w:rPr>
+          <w:rFonts w:ascii="TH SarabunPSK" w:hAnsi="TH SarabunPSK" w:cs="TH SarabunPSK" w:hint="cs"/>
+        </w:rPr>
+        <w:t xml:space="preserve">(False Positive): </w:t>
+      </w:r>
+      <w:r>
+        <w:rPr>
+          <w:rFonts w:ascii="TH SarabunPSK" w:hAnsi="TH SarabunPSK" w:cs="TH SarabunPSK" w:hint="cs"/>
+          <w:cs/>
+        </w:rPr>
+        <w:t>จำนวนภาพที่เป็นปอดปกติ</w:t>
+      </w:r>
+      <w:r>
+        <w:rPr>
+          <w:rFonts w:ascii="TH SarabunPSK" w:hAnsi="TH SarabunPSK" w:cs="TH SarabunPSK" w:hint="cs"/>
+        </w:rPr>
+        <w:t xml:space="preserve"> (No Finding) </w:t>
+      </w:r>
+      <w:r>
+        <w:rPr>
+          <w:rFonts w:ascii="TH SarabunPSK" w:hAnsi="TH SarabunPSK" w:cs="TH SarabunPSK" w:hint="cs"/>
+          <w:cs/>
+        </w:rPr>
+        <w:t>แต่แบบจำลองทำนายผิดพลาดว่าเป็น</w:t>
+      </w:r>
+      <w:r>
+        <w:rPr>
+          <w:rFonts w:ascii="TH SarabunPSK" w:hAnsi="TH SarabunPSK" w:cs="TH SarabunPSK" w:hint="cs"/>
+        </w:rPr>
+        <w:t xml:space="preserve"> Infiltration (</w:t>
+      </w:r>
+      <w:r>
+        <w:rPr>
+          <w:rFonts w:ascii="TH SarabunPSK" w:hAnsi="TH SarabunPSK" w:cs="TH SarabunPSK" w:hint="cs"/>
+          <w:cs/>
+        </w:rPr>
+        <w:t>ผลบวกลวง)</w:t>
+      </w:r>
+    </w:p>
+    <w:p>
+      <w:pPr>
+        <w:keepNext/>
+        <w:spacing w:before="120"/>
+        <w:ind w:left="360"/>
+        <w:rPr>
+          <w:rFonts w:ascii="TH SarabunPSK" w:hAnsi="TH SarabunPSK" w:cs="TH SarabunPSK" w:hint="cs"/>
+          <w:i/>
+        </w:rPr>
+      </w:pPr>
+      <w:r>
+        <w:rPr>
+          <w:rFonts w:ascii="TH SarabunPSK" w:hAnsi="TH SarabunPSK" w:cs="TH SarabunPSK"/>
+        </w:rPr>
+        <w:tab/>
+      </w:r>
+      <m:oMath>
+        <m:r>
+          <w:rPr>
+            <w:rFonts w:ascii="Cambria Math" w:hAnsi="Cambria Math" w:cs="TH SarabunPSK" w:hint="cs"/>
+          </w:rPr>
+          <m:t>FN</m:t>
+        </m:r>
+      </m:oMath>
+      <w:r>
+        <w:rPr>
+          <w:rFonts w:ascii="TH SarabunPSK" w:hAnsi="TH SarabunPSK" w:cs="TH SarabunPSK" w:hint="cs"/>
+        </w:rPr>
+        <w:t xml:space="preserve">(False Negative): </w:t>
+      </w:r>
+      <w:r>
+        <w:rPr>
+          <w:rFonts w:ascii="TH SarabunPSK" w:hAnsi="TH SarabunPSK" w:cs="TH SarabunPSK" w:hint="cs"/>
+          <w:cs/>
+        </w:rPr>
+        <w:t>จำนวนภาพที่มีภาวะ</w:t>
+      </w:r>
+      <w:r>
+        <w:rPr>
+          <w:rFonts w:ascii="TH SarabunPSK" w:hAnsi="TH SarabunPSK" w:cs="TH SarabunPSK" w:hint="cs"/>
+        </w:rPr>
+        <w:t xml:space="preserve"> Infiltration </w:t>
+      </w:r>
+      <w:r>
+        <w:rPr>
+          <w:rFonts w:ascii="TH SarabunPSK" w:hAnsi="TH SarabunPSK" w:cs="TH SarabunPSK" w:hint="cs"/>
+          <w:cs/>
+        </w:rPr>
+        <w:t>จริง</w:t>
+      </w:r>
+      <w:r>
+        <w:rPr>
+          <w:rFonts w:ascii="TH SarabunPSK" w:hAnsi="TH SarabunPSK" w:cs="TH SarabunPSK" w:hint="cs"/>
+        </w:rPr>
+        <w:t xml:space="preserve"> </w:t>
+      </w:r>
+      <w:r>
+        <w:rPr>
+          <w:rFonts w:ascii="TH SarabunPSK" w:hAnsi="TH SarabunPSK" w:cs="TH SarabunPSK" w:hint="cs"/>
+          <w:cs/>
+        </w:rPr>
+        <w:t>แต่แบบจำลองทำนายผิดพลาดว่าเป็น</w:t>
+      </w:r>
+      <w:r>
+        <w:rPr>
+          <w:rFonts w:ascii="TH SarabunPSK" w:hAnsi="TH SarabunPSK" w:cs="TH SarabunPSK" w:hint="cs"/>
+        </w:rPr>
+        <w:t xml:space="preserve"> No Finding (</w:t>
+      </w:r>
+      <w:r>
+        <w:rPr>
+          <w:rFonts w:ascii="TH SarabunPSK" w:hAnsi="TH SarabunPSK" w:cs="TH SarabunPSK" w:hint="cs"/>
+          <w:cs/>
+        </w:rPr>
+        <w:t>ผลลบลวง)</w:t>
+      </w:r>
+    </w:p>
+    <w:p>
+      <w:pPr>
+        <w:keepNext/>
+        <w:spacing w:before="120"/>
+        <w:ind w:left="360"/>
+        <w:rPr>
+          <w:rFonts w:ascii="TH SarabunPSK" w:hAnsi="TH SarabunPSK" w:cs="TH SarabunPSK" w:hint="cs"/>
+        </w:rPr>
+      </w:pPr>
+      <w:r>
+        <w:rPr>
+          <w:rFonts w:ascii="TH SarabunPSK" w:hAnsi="TH SarabunPSK" w:cs="TH SarabunPSK" w:hint="cs"/>
+          <w:cs/>
+        </w:rPr>
+        <w:t>สำหรับการทดลองที่</w:t>
+      </w:r>
+      <w:r>
+        <w:rPr>
+          <w:rFonts w:ascii="TH SarabunPSK" w:hAnsi="TH SarabunPSK" w:cs="TH SarabunPSK" w:hint="cs"/>
+        </w:rPr>
+        <w:t xml:space="preserve"> 2 </w:t>
+      </w:r>
+      <w:r>
+        <w:rPr>
+          <w:rFonts w:ascii="TH SarabunPSK" w:hAnsi="TH SarabunPSK" w:cs="TH SarabunPSK" w:hint="cs"/>
+          <w:cs/>
+        </w:rPr>
+        <w:t>รายงานค่าเฉลี่ยแบบ</w:t>
+      </w:r>
+      <w:r>
+        <w:rPr>
+          <w:rFonts w:ascii="TH SarabunPSK" w:hAnsi="TH SarabunPSK" w:cs="TH SarabunPSK" w:hint="cs"/>
+        </w:rPr>
+        <w:t xml:space="preserve"> Macro-average </w:t>
+      </w:r>
+      <w:r>
+        <w:rPr>
+          <w:rFonts w:ascii="TH SarabunPSK" w:hAnsi="TH SarabunPSK" w:cs="TH SarabunPSK" w:hint="cs"/>
+          <w:cs/>
+        </w:rPr>
+        <w:t>ของทั้ง</w:t>
+      </w:r>
+      <w:r>
+        <w:rPr>
+          <w:rFonts w:ascii="TH SarabunPSK" w:hAnsi="TH SarabunPSK" w:cs="TH SarabunPSK" w:hint="cs"/>
+        </w:rPr>
+        <w:t xml:space="preserve"> 16 </w:t>
+      </w:r>
+      <w:r>
+        <w:rPr>
+          <w:rFonts w:ascii="TH SarabunPSK" w:hAnsi="TH SarabunPSK" w:cs="TH SarabunPSK" w:hint="cs"/>
+          <w:cs/>
+        </w:rPr>
+        <w:t>สภาวะ</w:t>
+      </w:r>
+      <w:r>
+        <w:rPr>
+          <w:rFonts w:ascii="TH SarabunPSK" w:hAnsi="TH SarabunPSK" w:cs="TH SarabunPSK" w:hint="cs"/>
+        </w:rPr>
+        <w:t xml:space="preserve"> </w:t>
+      </w:r>
+      <w:r>
+        <w:rPr>
+          <w:rFonts w:ascii="TH SarabunPSK" w:hAnsi="TH SarabunPSK" w:cs="TH SarabunPSK" w:hint="cs"/>
+          <w:cs/>
+        </w:rPr>
+        <w:t>พร้อมทั้งนำเสนอผลการจำแนกในรูปแบบเมทริก</w:t>
+      </w:r>
+      <w:proofErr w:type="spellStart"/>
+      <w:r>
+        <w:rPr>
+          <w:rFonts w:ascii="TH SarabunPSK" w:hAnsi="TH SarabunPSK" w:cs="TH SarabunPSK" w:hint="cs"/>
+          <w:cs/>
+        </w:rPr>
+        <w:t>ซ์</w:t>
+      </w:r>
+      <w:proofErr w:type="spellEnd"/>
+      <w:r>
+        <w:rPr>
+          <w:rFonts w:ascii="TH SarabunPSK" w:hAnsi="TH SarabunPSK" w:cs="TH SarabunPSK" w:hint="cs"/>
+          <w:cs/>
+        </w:rPr>
+        <w:t>ความสับสน</w:t>
+      </w:r>
+      <w:r>
+        <w:rPr>
+          <w:rFonts w:ascii="TH SarabunPSK" w:hAnsi="TH SarabunPSK" w:cs="TH SarabunPSK" w:hint="cs"/>
+        </w:rPr>
+        <w:t xml:space="preserve"> (Confusion Matrix)</w:t>
+      </w:r>
+    </w:p>
+    <w:p>
+      <w:r>
+        <w:br w:type="page"/>
       </w:r>
     </w:p>
     <w:p>
@@ -9733,6 +10949,7 @@
         <w:ind w:left="360"/>
       </w:pPr>
       <w:r>
+        <w:lastRenderedPageBreak/>
         <w:t xml:space="preserve">5.8 </w:t>
       </w:r>
       <w:proofErr w:type="spellStart"/>
@@ -9808,21 +11025,13 @@
       </w:r>
       <w:r>
         <w:tab/>
-        <w:t>Pointing Game Hit Rate (%</w:t>
-      </w:r>
-      <w:proofErr w:type="gramStart"/>
-      <w:r>
-        <w:t>)</w:t>
+        <w:t>Pointing Game Hit Rate (%)</w:t>
       </w:r>
       <w:r>
         <w:t xml:space="preserve"> </w:t>
       </w:r>
       <w:r>
-        <w:t>:</w:t>
-      </w:r>
-      <w:proofErr w:type="gramEnd"/>
-      <w:r>
-        <w:t xml:space="preserve"> </w:t>
+        <w:t xml:space="preserve">: </w:t>
       </w:r>
       <w:proofErr w:type="spellStart"/>
       <w:r>
@@ -9926,11 +11135,7 @@
       </w:r>
       <w:r>
         <w:tab/>
-        <w:t>Saliency Energy Inside Bounding Box (%</w:t>
-      </w:r>
-      <w:proofErr w:type="gramStart"/>
-      <w:r>
-        <w:t>)</w:t>
+        <w:t>Saliency Energy Inside Bounding Box (%)</w:t>
       </w:r>
       <w:r>
         <w:t xml:space="preserve"> </w:t>
@@ -9938,7 +11143,6 @@
       <w:r>
         <w:t>:</w:t>
       </w:r>
-      <w:proofErr w:type="gramEnd"/>
     </w:p>
     <w:p>
       <w:pPr>
@@ -10106,22 +11310,18 @@
         <w:t xml:space="preserve"> = {(</w:t>
       </w:r>
       <w:proofErr w:type="spellStart"/>
-      <w:proofErr w:type="gramStart"/>
       <w:r>
         <w:t>x,y</w:t>
       </w:r>
       <w:proofErr w:type="spellEnd"/>
-      <w:proofErr w:type="gramEnd"/>
       <w:r>
         <w:t>) | H(</w:t>
       </w:r>
       <w:proofErr w:type="spellStart"/>
-      <w:proofErr w:type="gramStart"/>
       <w:r>
         <w:t>x,y</w:t>
       </w:r>
       <w:proofErr w:type="spellEnd"/>
-      <w:proofErr w:type="gramEnd"/>
       <w:r>
         <w:t xml:space="preserve">) ≥ τ · max(H)} </w:t>
       </w:r>
@@ -10153,7 +11353,6 @@
             <w:rPr>
               <w:rFonts w:ascii="Cambria Math" w:hAnsi="Cambria Math"/>
             </w:rPr>
-            <w:lastRenderedPageBreak/>
             <m:t xml:space="preserve">IoU(τ) = </m:t>
           </m:r>
           <m:f>
@@ -10379,12 +11578,18 @@
       </w:r>
     </w:p>
     <w:p>
+      <w:r>
+        <w:br w:type="page"/>
+      </w:r>
+    </w:p>
+    <w:p>
       <w:pPr>
         <w:ind w:firstLine="720"/>
         <w:jc w:val="both"/>
       </w:pPr>
       <w:proofErr w:type="spellStart"/>
       <w:r>
+        <w:lastRenderedPageBreak/>
         <w:t>ผลการทดลองที่</w:t>
       </w:r>
       <w:proofErr w:type="spellEnd"/>
@@ -10420,15 +11625,7 @@
           <w:b/>
           <w:bCs/>
         </w:rPr>
-        <w:t xml:space="preserve"> </w:t>
-      </w:r>
-      <w:proofErr w:type="gramStart"/>
-      <w:r>
-        <w:rPr>
-          <w:b/>
-          <w:bCs/>
-        </w:rPr>
-        <w:t>4</w:t>
+        <w:t xml:space="preserve"> 4</w:t>
       </w:r>
       <w:r>
         <w:t xml:space="preserve">  </w:t>
@@ -10438,7 +11635,6 @@
         <w:t>ผลการจำแนกโรคบนชุดข้อมูล</w:t>
       </w:r>
       <w:proofErr w:type="spellEnd"/>
-      <w:proofErr w:type="gramEnd"/>
       <w:r>
         <w:t xml:space="preserve"> NIH ChestX-ray14 (</w:t>
       </w:r>
@@ -16084,15 +17280,7 @@
           <w:b/>
           <w:bCs/>
         </w:rPr>
-        <w:t xml:space="preserve"> </w:t>
-      </w:r>
-      <w:proofErr w:type="gramStart"/>
-      <w:r>
-        <w:rPr>
-          <w:b/>
-          <w:bCs/>
-        </w:rPr>
-        <w:t>5</w:t>
+        <w:t xml:space="preserve"> 5</w:t>
       </w:r>
       <w:r>
         <w:t xml:space="preserve">  </w:t>
@@ -16102,7 +17290,6 @@
         <w:t>ผลการจำแนกโรคบนชุดข้อมูล</w:t>
       </w:r>
       <w:proofErr w:type="spellEnd"/>
-      <w:proofErr w:type="gramEnd"/>
       <w:r>
         <w:t xml:space="preserve"> </w:t>
       </w:r>
@@ -21804,15 +22991,7 @@
           <w:b/>
           <w:bCs/>
         </w:rPr>
-        <w:t xml:space="preserve"> </w:t>
-      </w:r>
-      <w:proofErr w:type="gramStart"/>
-      <w:r>
-        <w:rPr>
-          <w:b/>
-          <w:bCs/>
-        </w:rPr>
-        <w:t>2</w:t>
+        <w:t xml:space="preserve"> 2</w:t>
       </w:r>
       <w:r>
         <w:t xml:space="preserve">  </w:t>
@@ -21822,7 +23001,6 @@
         <w:t>เมทริกซ์ความสับสน</w:t>
       </w:r>
       <w:proofErr w:type="spellEnd"/>
-      <w:proofErr w:type="gramEnd"/>
       <w:r>
         <w:t xml:space="preserve"> (Confusion Matrices) </w:t>
       </w:r>
@@ -21923,15 +23101,7 @@
           <w:b/>
           <w:bCs/>
         </w:rPr>
-        <w:t xml:space="preserve"> </w:t>
-      </w:r>
-      <w:proofErr w:type="gramStart"/>
-      <w:r>
-        <w:rPr>
-          <w:b/>
-          <w:bCs/>
-        </w:rPr>
-        <w:t>3</w:t>
+        <w:t xml:space="preserve"> 3</w:t>
       </w:r>
       <w:r>
         <w:t xml:space="preserve">  </w:t>
@@ -21941,7 +23111,6 @@
         <w:t>เมทริกซ์ความสับสน</w:t>
       </w:r>
       <w:proofErr w:type="spellEnd"/>
-      <w:proofErr w:type="gramEnd"/>
       <w:r>
         <w:t xml:space="preserve"> (Confusion Matrices) </w:t>
       </w:r>
@@ -25943,15 +27112,7 @@
           <w:b/>
           <w:bCs/>
         </w:rPr>
-        <w:t xml:space="preserve"> </w:t>
-      </w:r>
-      <w:proofErr w:type="gramStart"/>
-      <w:r>
-        <w:rPr>
-          <w:b/>
-          <w:bCs/>
-        </w:rPr>
-        <w:t>7</w:t>
+        <w:t xml:space="preserve"> 7</w:t>
       </w:r>
       <w:r>
         <w:t xml:space="preserve">  </w:t>
@@ -25960,14 +27121,7 @@
         <w:rPr>
           <w:cs/>
         </w:rPr>
-        <w:t>ผลเฉลี่ย</w:t>
-      </w:r>
-      <w:proofErr w:type="gramEnd"/>
-      <w:r>
-        <w:rPr>
-          <w:cs/>
-        </w:rPr>
-        <w:t xml:space="preserve"> </w:t>
+        <w:t xml:space="preserve">ผลเฉลี่ย </w:t>
       </w:r>
       <w:r>
         <w:t>16</w:t>
@@ -30344,32 +31498,22 @@
           <w:b/>
           <w:bCs/>
         </w:rPr>
-        <w:t xml:space="preserve"> </w:t>
-      </w:r>
-      <w:proofErr w:type="gramStart"/>
+        <w:t xml:space="preserve"> 8</w:t>
+      </w:r>
       <w:r>
         <w:rPr>
           <w:rFonts w:ascii="TH SarabunPSK" w:hAnsi="TH SarabunPSK" w:cs="TH SarabunPSK" w:hint="cs"/>
-          <w:b/>
-          <w:bCs/>
-        </w:rPr>
-        <w:t>8</w:t>
-      </w:r>
+        </w:rPr>
+        <w:t xml:space="preserve">  </w:t>
+      </w:r>
+      <w:proofErr w:type="spellStart"/>
       <w:r>
         <w:rPr>
           <w:rFonts w:ascii="TH SarabunPSK" w:hAnsi="TH SarabunPSK" w:cs="TH SarabunPSK" w:hint="cs"/>
         </w:rPr>
-        <w:t xml:space="preserve">  </w:t>
-      </w:r>
-      <w:proofErr w:type="spellStart"/>
-      <w:r>
-        <w:rPr>
-          <w:rFonts w:ascii="TH SarabunPSK" w:hAnsi="TH SarabunPSK" w:cs="TH SarabunPSK" w:hint="cs"/>
-        </w:rPr>
         <w:t>วิธีที่ให้ผลดีที่สุดแยกตามตระกูลสัญญาณรบกวน</w:t>
       </w:r>
       <w:proofErr w:type="spellEnd"/>
-      <w:proofErr w:type="gramEnd"/>
       <w:r>
         <w:rPr>
           <w:rFonts w:ascii="TH SarabunPSK" w:hAnsi="TH SarabunPSK" w:cs="TH SarabunPSK" w:hint="cs"/>
@@ -32060,15 +33204,7 @@
           <w:b/>
           <w:bCs/>
         </w:rPr>
-        <w:t xml:space="preserve"> </w:t>
-      </w:r>
-      <w:proofErr w:type="gramStart"/>
-      <w:r>
-        <w:rPr>
-          <w:b/>
-          <w:bCs/>
-        </w:rPr>
-        <w:t>4</w:t>
+        <w:t xml:space="preserve"> 4</w:t>
       </w:r>
       <w:r>
         <w:t xml:space="preserve">  </w:t>
@@ -32078,7 +33214,6 @@
         <w:t>เมทริกซ์ความสับสนรวม</w:t>
       </w:r>
       <w:proofErr w:type="spellEnd"/>
-      <w:proofErr w:type="gramEnd"/>
       <w:r>
         <w:t xml:space="preserve"> 16 </w:t>
       </w:r>
@@ -32192,15 +33327,7 @@
           <w:b/>
           <w:bCs/>
         </w:rPr>
-        <w:t xml:space="preserve"> </w:t>
-      </w:r>
-      <w:proofErr w:type="gramStart"/>
-      <w:r>
-        <w:rPr>
-          <w:b/>
-          <w:bCs/>
-        </w:rPr>
-        <w:t>5</w:t>
+        <w:t xml:space="preserve"> 5</w:t>
       </w:r>
       <w:r>
         <w:t xml:space="preserve">  </w:t>
@@ -32210,7 +33337,6 @@
         <w:t>เมทริกซ์ความสับสนรวม</w:t>
       </w:r>
       <w:proofErr w:type="spellEnd"/>
-      <w:proofErr w:type="gramEnd"/>
       <w:r>
         <w:t xml:space="preserve"> 16 </w:t>
       </w:r>
@@ -32281,15 +33407,7 @@
           <w:b/>
           <w:bCs/>
         </w:rPr>
-        <w:t xml:space="preserve"> </w:t>
-      </w:r>
-      <w:proofErr w:type="gramStart"/>
-      <w:r>
-        <w:rPr>
-          <w:b/>
-          <w:bCs/>
-        </w:rPr>
-        <w:t>9</w:t>
+        <w:t xml:space="preserve"> 9</w:t>
       </w:r>
       <w:r>
         <w:t xml:space="preserve">  </w:t>
@@ -32299,7 +33417,6 @@
         <w:t>คุณภาพภาพ</w:t>
       </w:r>
       <w:proofErr w:type="spellEnd"/>
-      <w:proofErr w:type="gramEnd"/>
       <w:r>
         <w:t xml:space="preserve"> (PSNR/SSIM) </w:t>
       </w:r>
@@ -33466,15 +34583,7 @@
           <w:b/>
           <w:bCs/>
         </w:rPr>
-        <w:t xml:space="preserve"> </w:t>
-      </w:r>
-      <w:proofErr w:type="gramStart"/>
-      <w:r>
-        <w:rPr>
-          <w:b/>
-          <w:bCs/>
-        </w:rPr>
-        <w:t>6</w:t>
+        <w:t xml:space="preserve"> 6</w:t>
       </w:r>
       <w:r>
         <w:t xml:space="preserve">  </w:t>
@@ -33484,7 +34593,6 @@
         <w:t>ความสัมพันธ์ระหว่างค่า</w:t>
       </w:r>
       <w:proofErr w:type="spellEnd"/>
-      <w:proofErr w:type="gramEnd"/>
       <w:r>
         <w:t xml:space="preserve"> PSNR </w:t>
       </w:r>
@@ -35736,15 +36844,7 @@
           <w:b/>
           <w:bCs/>
         </w:rPr>
-        <w:t xml:space="preserve"> </w:t>
-      </w:r>
-      <w:proofErr w:type="gramStart"/>
-      <w:r>
-        <w:rPr>
-          <w:b/>
-          <w:bCs/>
-        </w:rPr>
-        <w:t>10</w:t>
+        <w:t xml:space="preserve"> 10</w:t>
       </w:r>
       <w:r>
         <w:t xml:space="preserve">  </w:t>
@@ -35754,7 +36854,6 @@
         <w:t>แผนและระยะเวลาดำเนินการ</w:t>
       </w:r>
       <w:proofErr w:type="spellEnd"/>
-      <w:proofErr w:type="gramEnd"/>
     </w:p>
     <w:tbl>
       <w:tblPr>
@@ -38977,19 +40076,19 @@
     </w:p>
     <w:p>
       <w:pPr>
+        <w:pStyle w:val="ListParagraph"/>
+        <w:numPr>
+          <w:ilvl w:val="0"/>
+          <w:numId w:val="5"/>
+        </w:numPr>
         <w:tabs>
           <w:tab w:val="left" w:pos="720"/>
         </w:tabs>
         <w:spacing w:after="60"/>
-        <w:ind w:left="1440" w:hanging="1440"/>
+        <w:ind w:left="1440" w:hanging="1080"/>
+        <w:jc w:val="both"/>
       </w:pPr>
       <w:r>
-        <w:t>1.</w:t>
-      </w:r>
-      <w:r>
-        <w:tab/>
-      </w:r>
-      <w:r>
         <w:t xml:space="preserve">Adebayo, J., Gilmer, J., </w:t>
       </w:r>
       <w:proofErr w:type="spellStart"/>
@@ -38998,766 +40097,624 @@
       </w:r>
       <w:proofErr w:type="spellEnd"/>
       <w:r>
-        <w:t>, M., Goodfellow, I., Hardt, M., &amp; Kim, B. (2018). Sanity checks for saliency maps. In Advances in Neural Information Processing Systems (Vol. 31, pp. 9505–9515). https://proceedings.neurips.cc/paper/2018/hash/294a8ed24b1ad22ec2e7efea049b873a-Abstract.html</w:t>
+        <w:t>, M., Goodfellow, I., Hardt, M., &amp; Kim, B. (2018). Sanity checks for saliency maps. In Advances in Neural Information Processing Systems (Vol. 31, pp. 9505–9515).</w:t>
+      </w:r>
+      <w:r>
+        <w:t xml:space="preserve"> </w:t>
       </w:r>
     </w:p>
     <w:p>
       <w:pPr>
+        <w:pStyle w:val="ListParagraph"/>
         <w:tabs>
           <w:tab w:val="left" w:pos="720"/>
         </w:tabs>
         <w:spacing w:after="60"/>
-        <w:ind w:left="1440" w:hanging="1440"/>
+        <w:ind w:left="1440"/>
       </w:pPr>
       <w:r>
-        <w:t>2.</w:t>
-      </w:r>
-      <w:r>
-        <w:tab/>
-        <w:t xml:space="preserve">Byeon, H., Seno, M. E., </w:t>
-      </w:r>
-      <w:proofErr w:type="spellStart"/>
-      <w:r>
-        <w:t>Nimma</w:t>
-      </w:r>
-      <w:proofErr w:type="spellEnd"/>
-      <w:r>
-        <w:t xml:space="preserve">, D., Ramesh, J. V. N., Zaidi, A., </w:t>
-      </w:r>
-      <w:proofErr w:type="spellStart"/>
-      <w:r>
-        <w:t>AlGhamdi</w:t>
-      </w:r>
-      <w:proofErr w:type="spellEnd"/>
-      <w:r>
-        <w:t xml:space="preserve">, A., ... &amp; Shabaz, M. (2025). Privacy-preserving explainable AI </w:t>
-      </w:r>
-      <w:proofErr w:type="gramStart"/>
-      <w:r>
-        <w:t>enable</w:t>
-      </w:r>
-      <w:proofErr w:type="gramEnd"/>
-      <w:r>
-        <w:t xml:space="preserve"> federated learning-based denoising fingerprint recognition model. </w:t>
-      </w:r>
-      <w:r>
-        <w:rPr>
-          <w:i/>
-          <w:iCs/>
-        </w:rPr>
-        <w:t>Image and Vision Computing, 154</w:t>
-      </w:r>
-      <w:r>
-        <w:t>, 105420. https://doi.org/10.1016/j.imavis.2025.105420</w:t>
+        <w:t>https://proceedings.neurips.cc/paper/2018/hash/294a8ed24b1ad22ec2e7efea049b873a-Abstract.html</w:t>
       </w:r>
     </w:p>
     <w:p>
       <w:pPr>
+        <w:pStyle w:val="ListParagraph"/>
+        <w:numPr>
+          <w:ilvl w:val="0"/>
+          <w:numId w:val="5"/>
+        </w:numPr>
         <w:tabs>
           <w:tab w:val="left" w:pos="720"/>
         </w:tabs>
         <w:spacing w:after="60"/>
-        <w:ind w:left="1440" w:hanging="1440"/>
+        <w:ind w:left="1440" w:hanging="1080"/>
+        <w:jc w:val="thaiDistribute"/>
       </w:pPr>
       <w:r>
-        <w:t>3.</w:t>
-      </w:r>
-      <w:r>
-        <w:tab/>
-        <w:t xml:space="preserve">Chattopadhyay, S. (2022). A study on various common denoising methods on chest X-ray images. </w:t>
-      </w:r>
-      <w:r>
-        <w:rPr>
-          <w:i/>
-          <w:iCs/>
-        </w:rPr>
-        <w:t>Artificial Intelligence Evolution, 3</w:t>
-      </w:r>
-      <w:r>
-        <w:t>(2), 87–106. https://doi.org/10.37256/aie.3220221714</w:t>
+        <w:t xml:space="preserve">Byeon, H., Seno, M. E., </w:t>
+      </w:r>
+      <w:proofErr w:type="spellStart"/>
+      <w:r>
+        <w:t>Nimma</w:t>
+      </w:r>
+      <w:proofErr w:type="spellEnd"/>
+      <w:r>
+        <w:t xml:space="preserve">, D., Ramesh, J. V. N., Zaidi, A., </w:t>
+      </w:r>
+      <w:proofErr w:type="spellStart"/>
+      <w:r>
+        <w:t>AlGhamdi</w:t>
+      </w:r>
+      <w:proofErr w:type="spellEnd"/>
+      <w:r>
+        <w:t>, A., ... &amp; Shabaz, M. (2025). Privacy-preserving explainable AI enable federated learning-based denoising fingerprint recognition model. Image and Vision Computing, 154, 105420. https://doi.org/10.1016/j.imavis.2025.105420</w:t>
       </w:r>
     </w:p>
     <w:p>
       <w:pPr>
+        <w:pStyle w:val="ListParagraph"/>
+        <w:numPr>
+          <w:ilvl w:val="0"/>
+          <w:numId w:val="5"/>
+        </w:numPr>
         <w:tabs>
           <w:tab w:val="left" w:pos="720"/>
         </w:tabs>
         <w:spacing w:after="60"/>
-        <w:ind w:left="1440" w:hanging="1440"/>
+        <w:ind w:left="1440" w:hanging="1080"/>
+        <w:jc w:val="thaiDistribute"/>
       </w:pPr>
       <w:r>
-        <w:t>4.</w:t>
-      </w:r>
-      <w:r>
-        <w:tab/>
-        <w:t xml:space="preserve">Chrysoula, T. (2023). </w:t>
-      </w:r>
-      <w:r>
-        <w:rPr>
-          <w:i/>
-          <w:iCs/>
-        </w:rPr>
-        <w:t>Explainable artificial intelligence for deep learning methods in chest X-ray classification</w:t>
-      </w:r>
-      <w:r>
-        <w:t xml:space="preserve"> [</w:t>
-      </w:r>
-      <w:proofErr w:type="gramStart"/>
-      <w:r>
-        <w:t>Master's</w:t>
-      </w:r>
-      <w:proofErr w:type="gramEnd"/>
-      <w:r>
-        <w:t xml:space="preserve"> thesis, National and </w:t>
-      </w:r>
-      <w:proofErr w:type="spellStart"/>
-      <w:r>
-        <w:t>Kapodistrian</w:t>
-      </w:r>
-      <w:proofErr w:type="spellEnd"/>
-      <w:r>
-        <w:t xml:space="preserve"> University of Athens]. https://pergamos.lib.uoa.gr/uoa/dl/object/3396182</w:t>
+        <w:t>Chattopadhyay, S. (2022). A study on various common denoising methods on chest X-ray images. Artificial Intelligence Evolution, 3(2), 87–106. https://doi.org/10.37256/aie.3220221714</w:t>
       </w:r>
     </w:p>
     <w:p>
       <w:pPr>
+        <w:pStyle w:val="ListParagraph"/>
+        <w:numPr>
+          <w:ilvl w:val="0"/>
+          <w:numId w:val="5"/>
+        </w:numPr>
         <w:tabs>
           <w:tab w:val="left" w:pos="720"/>
         </w:tabs>
         <w:spacing w:after="60"/>
-        <w:ind w:left="1440" w:hanging="1440"/>
+        <w:ind w:left="1440" w:hanging="1080"/>
+        <w:jc w:val="thaiDistribute"/>
       </w:pPr>
       <w:r>
-        <w:t>5.</w:t>
-      </w:r>
-      <w:r>
-        <w:tab/>
-        <w:t xml:space="preserve">Chutia, U., Tewari, A. S., &amp; Singh, J. P. (2024). Collapsed lung disease classification by coupling denoising algorithms and deep learning techniques. </w:t>
-      </w:r>
-      <w:r>
-        <w:rPr>
-          <w:i/>
-          <w:iCs/>
-        </w:rPr>
-        <w:t>Network Modeling Analysis in Health Informatics and Bioinformatics, 13</w:t>
-      </w:r>
-      <w:r>
-        <w:t>(1), 1. https://doi.org/10.1007/s13721-023-00435-0</w:t>
+        <w:t xml:space="preserve">Chrysoula, T. (2023). Explainable artificial intelligence for deep learning methods in chest X-ray classification [Master's thesis, National and </w:t>
+      </w:r>
+      <w:proofErr w:type="spellStart"/>
+      <w:r>
+        <w:t>Kapodistrian</w:t>
+      </w:r>
+      <w:proofErr w:type="spellEnd"/>
+      <w:r>
+        <w:t xml:space="preserve"> University of Athens]. https://pergamos.lib.uoa.gr/uoa/dl/object/3396182</w:t>
       </w:r>
     </w:p>
     <w:p>
       <w:pPr>
+        <w:pStyle w:val="ListParagraph"/>
+        <w:numPr>
+          <w:ilvl w:val="0"/>
+          <w:numId w:val="5"/>
+        </w:numPr>
         <w:tabs>
           <w:tab w:val="left" w:pos="720"/>
         </w:tabs>
         <w:spacing w:after="60"/>
-        <w:ind w:left="1440" w:hanging="1440"/>
+        <w:ind w:left="1440" w:hanging="1080"/>
+        <w:jc w:val="thaiDistribute"/>
       </w:pPr>
       <w:r>
-        <w:lastRenderedPageBreak/>
-        <w:t>6.</w:t>
-      </w:r>
-      <w:r>
-        <w:tab/>
-        <w:t xml:space="preserve">Dhar, T., Dey, N., Borra, S., &amp; Sherratt, R. S. (2023). Challenges of deep learning in medical image analysis—Improving explainability and trust. </w:t>
-      </w:r>
-      <w:r>
-        <w:rPr>
-          <w:i/>
-          <w:iCs/>
-        </w:rPr>
-        <w:t>IEEE Transactions on Technology and Society, 4</w:t>
-      </w:r>
-      <w:r>
-        <w:t>(1), 68–75. https://doi.org/10.1109/TTS.2023.3234203</w:t>
+        <w:t>Chutia, U., Tewari, A. S., &amp; Singh, J. P. (2024). Collapsed lung disease classification by coupling denoising algorithms and deep learning techniques. Network Modeling Analysis in Health Informatics and Bioinformatics, 13(1), 1. https://doi.org/10.1007/s13721-023-00435-0</w:t>
       </w:r>
     </w:p>
     <w:p>
       <w:pPr>
+        <w:pStyle w:val="ListParagraph"/>
+        <w:numPr>
+          <w:ilvl w:val="0"/>
+          <w:numId w:val="5"/>
+        </w:numPr>
         <w:tabs>
           <w:tab w:val="left" w:pos="720"/>
         </w:tabs>
         <w:spacing w:after="60"/>
-        <w:ind w:left="1440" w:hanging="1440"/>
+        <w:ind w:left="1440" w:hanging="1080"/>
+        <w:jc w:val="thaiDistribute"/>
       </w:pPr>
       <w:r>
-        <w:t>7.</w:t>
-      </w:r>
-      <w:r>
-        <w:tab/>
-        <w:t xml:space="preserve">Foi, A., </w:t>
-      </w:r>
-      <w:proofErr w:type="spellStart"/>
-      <w:r>
-        <w:t>Trimeche</w:t>
-      </w:r>
-      <w:proofErr w:type="spellEnd"/>
-      <w:r>
-        <w:t xml:space="preserve">, M., </w:t>
-      </w:r>
-      <w:proofErr w:type="spellStart"/>
-      <w:r>
-        <w:t>Katkovnik</w:t>
-      </w:r>
-      <w:proofErr w:type="spellEnd"/>
-      <w:r>
-        <w:t xml:space="preserve">, V., &amp; </w:t>
-      </w:r>
-      <w:proofErr w:type="spellStart"/>
-      <w:r>
-        <w:t>Egiazarian</w:t>
-      </w:r>
-      <w:proofErr w:type="spellEnd"/>
-      <w:r>
-        <w:t xml:space="preserve">, K. (2008). Practical </w:t>
-      </w:r>
-      <w:proofErr w:type="spellStart"/>
-      <w:r>
-        <w:t>Poissonian</w:t>
-      </w:r>
-      <w:proofErr w:type="spellEnd"/>
-      <w:r>
-        <w:t xml:space="preserve">-Gaussian noise modeling and fitting for single-image raw-data. </w:t>
-      </w:r>
-      <w:r>
-        <w:rPr>
-          <w:i/>
-          <w:iCs/>
-        </w:rPr>
-        <w:t>IEEE Transactions on Image Processing, 17</w:t>
-      </w:r>
-      <w:r>
-        <w:t>(10), 1737–1754. https://doi.org/10.1109/TIP.2008.2001399</w:t>
+        <w:lastRenderedPageBreak/>
+        <w:t>Dhar, T., Dey, N., Borra, S., &amp; Sherratt, R. S. (2023). Challenges of deep learning in medical image analysis—Improving explainability and trust. IEEE Transactions on Technology and Society, 4(1), 68–75. https://doi.org/10.1109/TTS.2023.3234203</w:t>
       </w:r>
     </w:p>
     <w:p>
       <w:pPr>
+        <w:pStyle w:val="ListParagraph"/>
+        <w:numPr>
+          <w:ilvl w:val="0"/>
+          <w:numId w:val="5"/>
+        </w:numPr>
         <w:tabs>
           <w:tab w:val="left" w:pos="720"/>
         </w:tabs>
         <w:spacing w:after="60"/>
-        <w:ind w:left="1440" w:hanging="1440"/>
+        <w:ind w:left="1440" w:hanging="1080"/>
+        <w:jc w:val="thaiDistribute"/>
       </w:pPr>
       <w:r>
-        <w:t>8.</w:t>
-      </w:r>
-      <w:r>
-        <w:tab/>
-        <w:t xml:space="preserve">He, K., Zhang, X., Ren, S., &amp; Sun, J. (2016). Deep residual learning for image recognition. In </w:t>
-      </w:r>
-      <w:r>
-        <w:rPr>
-          <w:i/>
-          <w:iCs/>
-        </w:rPr>
-        <w:t>Proceedings of the IEEE Conference on Computer Vision and Pattern Recognition (CVPR)</w:t>
-      </w:r>
-      <w:r>
-        <w:t xml:space="preserve"> (pp. 770–778). https://doi.org/10.1109/CVPR.2016.90</w:t>
+        <w:t>Fawcett, T. (2006). An introduction to ROC analysis. Pattern Recognition Letters, 27(8), 861–874. https://doi.org/10.1016/j.patrec.2005.10.010</w:t>
       </w:r>
     </w:p>
     <w:p>
       <w:pPr>
+        <w:pStyle w:val="ListParagraph"/>
+        <w:numPr>
+          <w:ilvl w:val="0"/>
+          <w:numId w:val="5"/>
+        </w:numPr>
         <w:tabs>
           <w:tab w:val="left" w:pos="720"/>
         </w:tabs>
         <w:spacing w:after="60"/>
-        <w:ind w:left="1440" w:hanging="1440"/>
+        <w:ind w:left="1440" w:hanging="1080"/>
+        <w:jc w:val="thaiDistribute"/>
       </w:pPr>
       <w:r>
-        <w:t>9.</w:t>
-      </w:r>
-      <w:r>
-        <w:tab/>
-        <w:t xml:space="preserve">Lundberg, S. M., &amp; Lee, S.-I. (2017). A unified approach to interpreting model predictions. In </w:t>
-      </w:r>
-      <w:r>
-        <w:rPr>
-          <w:i/>
-          <w:iCs/>
-        </w:rPr>
-        <w:t>Advances in Neural Information Processing Systems</w:t>
-      </w:r>
-      <w:r>
-        <w:t xml:space="preserve"> (Vol. 30, pp. 4765–4774). https://doi.org/10.48550/arXiv.1705.07874</w:t>
+        <w:t xml:space="preserve">Foi, A., </w:t>
+      </w:r>
+      <w:proofErr w:type="spellStart"/>
+      <w:r>
+        <w:t>Trimeche</w:t>
+      </w:r>
+      <w:proofErr w:type="spellEnd"/>
+      <w:r>
+        <w:t xml:space="preserve">, M., </w:t>
+      </w:r>
+      <w:proofErr w:type="spellStart"/>
+      <w:r>
+        <w:t>Katkovnik</w:t>
+      </w:r>
+      <w:proofErr w:type="spellEnd"/>
+      <w:r>
+        <w:t xml:space="preserve">, V., &amp; </w:t>
+      </w:r>
+      <w:proofErr w:type="spellStart"/>
+      <w:r>
+        <w:t>Egiazarian</w:t>
+      </w:r>
+      <w:proofErr w:type="spellEnd"/>
+      <w:r>
+        <w:t xml:space="preserve">, K. (2008). Practical </w:t>
+      </w:r>
+      <w:proofErr w:type="spellStart"/>
+      <w:r>
+        <w:t>Poissonian</w:t>
+      </w:r>
+      <w:proofErr w:type="spellEnd"/>
+      <w:r>
+        <w:t>-Gaussian noise modeling and fitting for single-image raw-data. IEEE Transactions on Image Processing, 17(10), 1737–1754. https://doi.org/10.1109/TIP.2008.2001399</w:t>
       </w:r>
     </w:p>
     <w:p>
       <w:pPr>
+        <w:pStyle w:val="ListParagraph"/>
+        <w:numPr>
+          <w:ilvl w:val="0"/>
+          <w:numId w:val="5"/>
+        </w:numPr>
         <w:tabs>
           <w:tab w:val="left" w:pos="720"/>
         </w:tabs>
         <w:spacing w:after="60"/>
-        <w:ind w:left="1440" w:hanging="1440"/>
+        <w:ind w:left="1440" w:hanging="1080"/>
+        <w:jc w:val="thaiDistribute"/>
       </w:pPr>
       <w:r>
-        <w:t>10.</w:t>
-      </w:r>
-      <w:r>
-        <w:tab/>
-        <w:t xml:space="preserve">Nguyen, H. Q., Lam, K., Le, L. T., Pham, H. H., Tran, D. Q., Nguyen, D. B., ... &amp; Vu, V. (2022). </w:t>
-      </w:r>
-      <w:proofErr w:type="spellStart"/>
-      <w:r>
-        <w:t>VinDr</w:t>
-      </w:r>
-      <w:proofErr w:type="spellEnd"/>
-      <w:r>
-        <w:t xml:space="preserve">-CXR: An open dataset of chest X-rays with radiologist's annotations. </w:t>
-      </w:r>
-      <w:r>
-        <w:rPr>
-          <w:i/>
-          <w:iCs/>
-        </w:rPr>
-        <w:t>Scientific Data, 9</w:t>
-      </w:r>
-      <w:r>
-        <w:t>, 429. https://doi.org/10.1038/s41597-022-01498-w</w:t>
+        <w:t>He, K., Zhang, X., Ren, S., &amp; Sun, J. (2016). Deep residual learning for image recognition. In Proceedings of the IEEE Conference on Computer Vision and Pattern Recognition (CVPR) (pp. 770–778). https://doi.org/10.1109/CVPR.2016.90</w:t>
       </w:r>
     </w:p>
     <w:p>
       <w:pPr>
+        <w:pStyle w:val="ListParagraph"/>
+        <w:numPr>
+          <w:ilvl w:val="0"/>
+          <w:numId w:val="5"/>
+        </w:numPr>
         <w:tabs>
           <w:tab w:val="left" w:pos="720"/>
         </w:tabs>
         <w:spacing w:after="60"/>
-        <w:ind w:left="1440" w:hanging="1440"/>
+        <w:ind w:left="1440" w:hanging="1080"/>
+        <w:jc w:val="thaiDistribute"/>
       </w:pPr>
       <w:r>
-        <w:t>11.</w:t>
-      </w:r>
-      <w:r>
-        <w:tab/>
-        <w:t>Parra-Cabrera, G., Jimenez-Delgado, J. J., &amp; Perez-</w:t>
-      </w:r>
-      <w:proofErr w:type="spellStart"/>
-      <w:r>
-        <w:t>Cano</w:t>
-      </w:r>
-      <w:proofErr w:type="spellEnd"/>
-      <w:r>
-        <w:t xml:space="preserve">, F. D. (2026). Artificial intelligence for pulmonary abnormality detection in chest X-ray imaging: A detailed review of methods, datasets and future directions. </w:t>
-      </w:r>
-      <w:r>
-        <w:rPr>
-          <w:i/>
-          <w:iCs/>
-        </w:rPr>
-        <w:t>Technologies, 14</w:t>
-      </w:r>
-      <w:r>
-        <w:t>(3), 147. https://doi.org/10.3390/technologies14030147</w:t>
+        <w:t>Lundberg, S. M., &amp; Lee, S.-I. (2017). A unified approach to interpreting model predictions. In Advances in Neural Information Processing Systems (Vol. 30, pp. 4765–4774). https://doi.org/10.48550/arXiv.1705.07874</w:t>
       </w:r>
     </w:p>
     <w:p>
       <w:pPr>
+        <w:pStyle w:val="ListParagraph"/>
+        <w:numPr>
+          <w:ilvl w:val="0"/>
+          <w:numId w:val="5"/>
+        </w:numPr>
         <w:tabs>
           <w:tab w:val="left" w:pos="720"/>
         </w:tabs>
         <w:spacing w:after="60"/>
-        <w:ind w:left="1440" w:hanging="1440"/>
+        <w:ind w:left="1440" w:hanging="1080"/>
+        <w:jc w:val="thaiDistribute"/>
       </w:pPr>
       <w:r>
-        <w:t>12.</w:t>
-      </w:r>
-      <w:r>
-        <w:tab/>
-        <w:t xml:space="preserve">Rahman, T., Khandakar, A., </w:t>
+        <w:t xml:space="preserve">Nguyen, H. Q., Lam, K., Le, L. T., Pham, H. H., Tran, D. Q., Nguyen, D. B., ... &amp; Vu, V. (2022). </w:t>
       </w:r>
       <w:proofErr w:type="spellStart"/>
       <w:r>
-        <w:t>Qiblawey</w:t>
+        <w:t>VinDr</w:t>
       </w:r>
       <w:proofErr w:type="spellEnd"/>
       <w:r>
-        <w:t xml:space="preserve">, Y., Tahir, A., </w:t>
-      </w:r>
-      <w:proofErr w:type="spellStart"/>
-      <w:r>
-        <w:t>Kiranyaz</w:t>
-      </w:r>
-      <w:proofErr w:type="spellEnd"/>
-      <w:r>
-        <w:t xml:space="preserve">, S., Kashem, S. B. A., ... &amp; Chowdhury, M. E. (2021). Exploring the effect of image enhancement techniques on COVID-19 detection using chest X-ray images. </w:t>
-      </w:r>
-      <w:r>
-        <w:rPr>
-          <w:i/>
-          <w:iCs/>
-        </w:rPr>
-        <w:t>Computers in Biology and Medicine, 132</w:t>
-      </w:r>
-      <w:r>
-        <w:t>, 104319. https://doi.org/10.1016/j.compbiomed.2021.104319</w:t>
+        <w:t>-CXR: An open dataset of chest X-rays with radiologist's annotations. Scientific Data, 9, 429. https://doi.org/10.1038/s41597-022-01498-w</w:t>
       </w:r>
     </w:p>
     <w:p>
       <w:pPr>
+        <w:pStyle w:val="ListParagraph"/>
+        <w:numPr>
+          <w:ilvl w:val="0"/>
+          <w:numId w:val="5"/>
+        </w:numPr>
         <w:tabs>
           <w:tab w:val="left" w:pos="720"/>
         </w:tabs>
         <w:spacing w:after="60"/>
-        <w:ind w:left="1440" w:hanging="1440"/>
+        <w:ind w:left="1440" w:hanging="1080"/>
+        <w:jc w:val="thaiDistribute"/>
       </w:pPr>
       <w:r>
-        <w:t>13.</w:t>
-      </w:r>
-      <w:r>
-        <w:tab/>
+        <w:t>Parra-Cabrera, G., Jimenez-Delgado, J. J., &amp; Perez-</w:t>
       </w:r>
       <w:proofErr w:type="spellStart"/>
       <w:r>
-        <w:t>Rajpurkar</w:t>
+        <w:t>Cano</w:t>
       </w:r>
       <w:proofErr w:type="spellEnd"/>
       <w:r>
-        <w:t xml:space="preserve">, P., Irvin, J., Zhu, K., Yang, B., Mehta, H., Duan, T., Ding, D., Bagul, A., Langlotz, C., </w:t>
-      </w:r>
-      <w:proofErr w:type="spellStart"/>
-      <w:r>
-        <w:t>Shpanskaya</w:t>
-      </w:r>
-      <w:proofErr w:type="spellEnd"/>
-      <w:r>
-        <w:t xml:space="preserve">, K., Lungren, M. P., &amp; Ng, A. Y. (2017). </w:t>
-      </w:r>
-      <w:proofErr w:type="spellStart"/>
-      <w:r>
-        <w:t>CheXNet</w:t>
-      </w:r>
-      <w:proofErr w:type="spellEnd"/>
-      <w:r>
-        <w:t xml:space="preserve">: Radiologist-level pneumonia detection on chest X-rays with deep learning. </w:t>
-      </w:r>
-      <w:proofErr w:type="spellStart"/>
-      <w:r>
-        <w:rPr>
-          <w:i/>
-          <w:iCs/>
-        </w:rPr>
-        <w:t>arXiv</w:t>
-      </w:r>
-      <w:proofErr w:type="spellEnd"/>
-      <w:r>
-        <w:t>. https://doi.org/10.48550/arXiv.1711.05225</w:t>
+        <w:t>, F. D. (2026). Artificial intelligence for pulmonary abnormality detection in chest X-ray imaging: A detailed review of methods, datasets and future directions. Technologies, 14(3), 147. https://doi.org/10.3390/technologies14030147</w:t>
       </w:r>
     </w:p>
     <w:p>
       <w:pPr>
+        <w:pStyle w:val="ListParagraph"/>
+        <w:numPr>
+          <w:ilvl w:val="0"/>
+          <w:numId w:val="5"/>
+        </w:numPr>
         <w:tabs>
           <w:tab w:val="left" w:pos="720"/>
         </w:tabs>
         <w:spacing w:after="60"/>
-        <w:ind w:left="1440" w:hanging="1440"/>
+        <w:ind w:left="1440" w:hanging="1080"/>
+        <w:jc w:val="thaiDistribute"/>
       </w:pPr>
       <w:r>
-        <w:t>14.</w:t>
-      </w:r>
-      <w:r>
-        <w:tab/>
-        <w:t xml:space="preserve">Raoof, S., Feigin, D., Sung, A., Raoof, S., </w:t>
+        <w:t xml:space="preserve">Rahman, T., Khandakar, A., </w:t>
       </w:r>
       <w:proofErr w:type="spellStart"/>
       <w:r>
-        <w:t>Irugulpati</w:t>
+        <w:t>Qiblawey</w:t>
       </w:r>
       <w:proofErr w:type="spellEnd"/>
       <w:r>
-        <w:t xml:space="preserve">, L., &amp; Rosenow, E. C. (2012). Interpretation of plain chest roentgenogram. </w:t>
-      </w:r>
-      <w:r>
-        <w:rPr>
-          <w:i/>
-          <w:iCs/>
-        </w:rPr>
-        <w:t>Chest, 141</w:t>
-      </w:r>
-      <w:r>
-        <w:t>(2), 545–558. https://doi.org/10.1378/chest.10-1302</w:t>
+        <w:t xml:space="preserve">, Y., Tahir, A., </w:t>
+      </w:r>
+      <w:proofErr w:type="spellStart"/>
+      <w:r>
+        <w:t>Kiranyaz</w:t>
+      </w:r>
+      <w:proofErr w:type="spellEnd"/>
+      <w:r>
+        <w:t>, S., Kashem, S. B. A., ... &amp; Chowdhury, M. E. (2021). Exploring the effect of image enhancement techniques on COVID-19 detection using chest X-ray images. Computers in Biology and Medicine, 132, 104319. https://doi.org/10.1016/j.compbiomed.2021.104319</w:t>
       </w:r>
     </w:p>
     <w:p>
       <w:pPr>
+        <w:pStyle w:val="ListParagraph"/>
+        <w:numPr>
+          <w:ilvl w:val="0"/>
+          <w:numId w:val="5"/>
+        </w:numPr>
         <w:tabs>
           <w:tab w:val="left" w:pos="720"/>
         </w:tabs>
         <w:spacing w:after="60"/>
-        <w:ind w:left="1440" w:hanging="1440"/>
+        <w:ind w:left="1440" w:hanging="1080"/>
+        <w:jc w:val="thaiDistribute"/>
       </w:pPr>
-      <w:r>
-        <w:t>15.</w:t>
-      </w:r>
-      <w:r>
-        <w:tab/>
-        <w:t xml:space="preserve">Rudin, C. (2019). Stop explaining black box machine learning models for </w:t>
-      </w:r>
-      <w:proofErr w:type="gramStart"/>
-      <w:r>
-        <w:t>high stakes</w:t>
-      </w:r>
-      <w:proofErr w:type="gramEnd"/>
-      <w:r>
-        <w:t xml:space="preserve"> decisions and use interpretable models instead. </w:t>
-      </w:r>
-      <w:r>
-        <w:rPr>
-          <w:i/>
-          <w:iCs/>
-        </w:rPr>
-        <w:t>Nature Machine Intelligence, 1</w:t>
-      </w:r>
-      <w:r>
-        <w:t>(5), 206–215. https://doi.org/10.1038/s42256-019-0048-x</w:t>
+      <w:proofErr w:type="spellStart"/>
+      <w:r>
+        <w:t>Rajpurkar</w:t>
+      </w:r>
+      <w:proofErr w:type="spellEnd"/>
+      <w:r>
+        <w:t xml:space="preserve">, P., Irvin, J., Zhu, K., Yang, B., Mehta, H., Duan, T., Ding, D., Bagul, A., Langlotz, C., </w:t>
+      </w:r>
+      <w:proofErr w:type="spellStart"/>
+      <w:r>
+        <w:t>Shpanskaya</w:t>
+      </w:r>
+      <w:proofErr w:type="spellEnd"/>
+      <w:r>
+        <w:t xml:space="preserve">, K., Lungren, M. P., &amp; Ng, A. Y. (2017). </w:t>
+      </w:r>
+      <w:proofErr w:type="spellStart"/>
+      <w:r>
+        <w:t>CheXNet</w:t>
+      </w:r>
+      <w:proofErr w:type="spellEnd"/>
+      <w:r>
+        <w:t xml:space="preserve">: Radiologist-level pneumonia detection on chest X-rays with deep learning. </w:t>
+      </w:r>
+      <w:proofErr w:type="spellStart"/>
+      <w:r>
+        <w:t>arXiv</w:t>
+      </w:r>
+      <w:proofErr w:type="spellEnd"/>
+      <w:r>
+        <w:t>. https://doi.org/10.48550/arXiv.1711.05225</w:t>
       </w:r>
     </w:p>
     <w:p>
       <w:pPr>
+        <w:pStyle w:val="ListParagraph"/>
+        <w:numPr>
+          <w:ilvl w:val="0"/>
+          <w:numId w:val="5"/>
+        </w:numPr>
         <w:tabs>
           <w:tab w:val="left" w:pos="720"/>
         </w:tabs>
         <w:spacing w:after="60"/>
-        <w:ind w:left="1440" w:hanging="1440"/>
+        <w:ind w:left="1440" w:hanging="1080"/>
+        <w:jc w:val="thaiDistribute"/>
       </w:pPr>
       <w:r>
-        <w:lastRenderedPageBreak/>
-        <w:t>16.</w:t>
-      </w:r>
-      <w:r>
-        <w:tab/>
-        <w:t xml:space="preserve">Selvaraju, R. R., Cogswell, M., Das, A., Vedantam, R., Parikh, D., &amp; Batra, D. (2017). Grad-CAM: Visual explanations from deep networks via gradient-based localization. In </w:t>
-      </w:r>
-      <w:r>
-        <w:rPr>
-          <w:i/>
-          <w:iCs/>
-        </w:rPr>
-        <w:t>Proceedings of the IEEE International Conference on Computer Vision (ICCV)</w:t>
-      </w:r>
-      <w:r>
-        <w:t xml:space="preserve"> (pp. 618–626). https://doi.org/10.1109/ICCV.2017.74</w:t>
+        <w:t xml:space="preserve">Raoof, S., Feigin, D., Sung, A., Raoof, S., </w:t>
+      </w:r>
+      <w:proofErr w:type="spellStart"/>
+      <w:r>
+        <w:t>Irugulpati</w:t>
+      </w:r>
+      <w:proofErr w:type="spellEnd"/>
+      <w:r>
+        <w:t>, L., &amp; Rosenow, E. C. (2012). Interpretation of plain chest roentgenogram. Chest, 141(2), 545–558. https://doi.org/10.1378/chest.10-1302</w:t>
       </w:r>
     </w:p>
     <w:p>
       <w:pPr>
+        <w:pStyle w:val="ListParagraph"/>
+        <w:numPr>
+          <w:ilvl w:val="0"/>
+          <w:numId w:val="5"/>
+        </w:numPr>
         <w:tabs>
           <w:tab w:val="left" w:pos="720"/>
         </w:tabs>
         <w:spacing w:after="60"/>
-        <w:ind w:left="1440" w:hanging="1440"/>
+        <w:ind w:left="1440" w:hanging="1080"/>
+        <w:jc w:val="thaiDistribute"/>
       </w:pPr>
       <w:r>
-        <w:t>17.</w:t>
-      </w:r>
-      <w:r>
-        <w:tab/>
-        <w:t xml:space="preserve">Sheu, R. K., Pardeshi, M. S., Pai, K. C., Chen, L. C., Wu, C. L., &amp; Chen, W. C. (2023). Interpretable classification of pneumonia infection using </w:t>
-      </w:r>
-      <w:proofErr w:type="spellStart"/>
-      <w:r>
-        <w:t>eXplainable</w:t>
-      </w:r>
-      <w:proofErr w:type="spellEnd"/>
-      <w:r>
-        <w:t xml:space="preserve"> AI (XAI-ICP). </w:t>
-      </w:r>
-      <w:r>
-        <w:rPr>
-          <w:i/>
-          <w:iCs/>
-        </w:rPr>
-        <w:t>IEEE Access, 11</w:t>
-      </w:r>
-      <w:r>
-        <w:t>, 28896–28919. https://doi.org/10.1109/ACCESS.2023.3255403</w:t>
+        <w:lastRenderedPageBreak/>
+        <w:t>Rudin, C. (2019). Stop explaining black box machine learning models for high stakes decisions and use interpretable models instead. Nature Machine Intelligence, 1(5), 206–215. https://doi.org/10.1038/s42256-019-0048-x</w:t>
       </w:r>
     </w:p>
     <w:p>
       <w:pPr>
+        <w:pStyle w:val="ListParagraph"/>
+        <w:numPr>
+          <w:ilvl w:val="0"/>
+          <w:numId w:val="5"/>
+        </w:numPr>
         <w:tabs>
           <w:tab w:val="left" w:pos="720"/>
         </w:tabs>
         <w:spacing w:after="60"/>
-        <w:ind w:left="1440" w:hanging="1440"/>
+        <w:ind w:left="1440" w:hanging="1080"/>
+        <w:jc w:val="thaiDistribute"/>
       </w:pPr>
       <w:r>
-        <w:t>18.</w:t>
-      </w:r>
-      <w:r>
-        <w:tab/>
-        <w:t xml:space="preserve">Song, L., Sun, H., Xiao, H., Lam, S. K., Zhan, Y., Ren, G., &amp; Cai, J. (2025). Artificial intelligence for chest X-ray image enhancement. </w:t>
-      </w:r>
-      <w:r>
-        <w:rPr>
-          <w:i/>
-          <w:iCs/>
-        </w:rPr>
-        <w:t>Radiation Medicine and Protection, 6</w:t>
-      </w:r>
-      <w:r>
-        <w:t>(1), 61–68. https://doi.org/10.1016/j.radmp.2024.12.003</w:t>
+        <w:t xml:space="preserve">Saito, T., &amp; </w:t>
+      </w:r>
+      <w:proofErr w:type="spellStart"/>
+      <w:r>
+        <w:t>Rehmsmeier</w:t>
+      </w:r>
+      <w:proofErr w:type="spellEnd"/>
+      <w:r>
+        <w:t>, M. (2015). The precision-recall plot is more informative than the ROC plot when evaluating binary classifiers on imbalanced datasets. PLOS ONE, 10(3), e0118432. https://doi.org/10.1371/journal.pone.0118432</w:t>
       </w:r>
     </w:p>
     <w:p>
       <w:pPr>
+        <w:pStyle w:val="ListParagraph"/>
+        <w:numPr>
+          <w:ilvl w:val="0"/>
+          <w:numId w:val="5"/>
+        </w:numPr>
         <w:tabs>
           <w:tab w:val="left" w:pos="720"/>
         </w:tabs>
         <w:spacing w:after="60"/>
-        <w:ind w:left="1440" w:hanging="1440"/>
+        <w:ind w:left="1440" w:hanging="1080"/>
+        <w:jc w:val="thaiDistribute"/>
       </w:pPr>
       <w:r>
-        <w:t>19.</w:t>
-      </w:r>
-      <w:r>
-        <w:tab/>
-        <w:t xml:space="preserve">Thamilarasi, V., Asaithambi, A., &amp; Roselin, R. (2025). Enhanced ensemble segmentation of lung chest X-ray images by denoising autoencoder and CLAHE. </w:t>
-      </w:r>
-      <w:r>
-        <w:rPr>
-          <w:i/>
-          <w:iCs/>
-        </w:rPr>
-        <w:t>ICTACT Journal on Image and Video Processing, 15</w:t>
-      </w:r>
-      <w:r>
-        <w:t>(3), 3501–3508. https://doi.org/10.21917/ijivp.2025.0496</w:t>
+        <w:t>Selvaraju, R. R., Cogswell, M., Das, A., Vedantam, R., Parikh, D., &amp; Batra, D. (2017). Grad-CAM: Visual explanations from deep networks via gradient-based localization. In Proceedings of the IEEE International Conference on Computer Vision (ICCV) (pp. 618–626). https://doi.org/10.1109/ICCV.2017.74</w:t>
       </w:r>
     </w:p>
     <w:p>
       <w:pPr>
+        <w:pStyle w:val="ListParagraph"/>
+        <w:numPr>
+          <w:ilvl w:val="0"/>
+          <w:numId w:val="5"/>
+        </w:numPr>
         <w:tabs>
           <w:tab w:val="left" w:pos="720"/>
         </w:tabs>
         <w:spacing w:after="60"/>
-        <w:ind w:left="1440" w:hanging="1440"/>
+        <w:ind w:left="1440" w:hanging="1080"/>
+        <w:jc w:val="thaiDistribute"/>
       </w:pPr>
       <w:r>
-        <w:t>20.</w:t>
-      </w:r>
-      <w:r>
-        <w:tab/>
-        <w:t xml:space="preserve">van der Velden, B. H. M., </w:t>
+        <w:t xml:space="preserve">Sheu, R. K., Pardeshi, M. S., Pai, K. C., Chen, L. C., Wu, C. L., &amp; Chen, W. C. (2023). Interpretable classification of pneumonia infection using </w:t>
       </w:r>
       <w:proofErr w:type="spellStart"/>
       <w:r>
-        <w:t>Kuijf</w:t>
+        <w:t>eXplainable</w:t>
       </w:r>
       <w:proofErr w:type="spellEnd"/>
       <w:r>
-        <w:t xml:space="preserve">, H. J., Gilhuijs, K. G. A., &amp; </w:t>
-      </w:r>
-      <w:proofErr w:type="spellStart"/>
-      <w:r>
-        <w:t>Viergever</w:t>
-      </w:r>
-      <w:proofErr w:type="spellEnd"/>
-      <w:r>
-        <w:t xml:space="preserve">, M. A. (2022). Explainable artificial intelligence (XAI) in deep learning-based medical image analysis. </w:t>
-      </w:r>
-      <w:r>
-        <w:rPr>
-          <w:i/>
-          <w:iCs/>
-        </w:rPr>
-        <w:t>Medical Image Analysis, 79</w:t>
-      </w:r>
-      <w:r>
-        <w:t>, 102470. https://doi.org/10.1016/j.media.2022.102470</w:t>
+        <w:t xml:space="preserve"> AI (XAI-ICP). IEEE Access, 11, 28896–28919. https://doi.org/10.1109/ACCESS.2023.3255403</w:t>
       </w:r>
     </w:p>
     <w:p>
       <w:pPr>
+        <w:pStyle w:val="ListParagraph"/>
+        <w:numPr>
+          <w:ilvl w:val="0"/>
+          <w:numId w:val="5"/>
+        </w:numPr>
         <w:tabs>
           <w:tab w:val="left" w:pos="720"/>
         </w:tabs>
         <w:spacing w:after="60"/>
-        <w:ind w:left="1440" w:hanging="1440"/>
+        <w:ind w:left="1440" w:hanging="1080"/>
+        <w:jc w:val="thaiDistribute"/>
       </w:pPr>
       <w:r>
-        <w:t>21.</w:t>
-      </w:r>
-      <w:r>
-        <w:tab/>
-        <w:t xml:space="preserve">Wang, X., Peng, Y., Lu, L., Lu, Z., Bagheri, M., &amp; Summers, R. M. (2017). ChestX-ray8: Hospital-scale chest X-ray database and benchmarks on weakly-supervised classification and localization of common thorax diseases. In </w:t>
-      </w:r>
-      <w:r>
-        <w:rPr>
-          <w:i/>
-          <w:iCs/>
-        </w:rPr>
-        <w:t>Proceedings of the IEEE Conference on Computer Vision and Pattern Recognition (CVPR)</w:t>
-      </w:r>
-      <w:r>
-        <w:t xml:space="preserve"> (pp. 2097–2106). https://doi.org/10.1109/CVPR.2017.369</w:t>
+        <w:t>Song, L., Sun, H., Xiao, H., Lam, S. K., Zhan, Y., Ren, G., &amp; Cai, J. (2025). Artificial intelligence for chest X-ray image enhancement. Radiation Medicine and Protection, 6(1), 61–68. https://doi.org/10.1016/j.radmp.2024.12.003</w:t>
       </w:r>
     </w:p>
     <w:p>
       <w:pPr>
+        <w:pStyle w:val="ListParagraph"/>
+        <w:numPr>
+          <w:ilvl w:val="0"/>
+          <w:numId w:val="5"/>
+        </w:numPr>
         <w:tabs>
           <w:tab w:val="left" w:pos="720"/>
         </w:tabs>
         <w:spacing w:after="60"/>
-        <w:ind w:left="1440" w:hanging="1440"/>
+        <w:ind w:left="1440" w:hanging="1080"/>
+        <w:jc w:val="thaiDistribute"/>
       </w:pPr>
       <w:r>
-        <w:t>22.</w:t>
-      </w:r>
-      <w:r>
-        <w:tab/>
-        <w:t xml:space="preserve">Wang, Z., </w:t>
-      </w:r>
-      <w:proofErr w:type="spellStart"/>
-      <w:r>
-        <w:t>Bovik</w:t>
-      </w:r>
-      <w:proofErr w:type="spellEnd"/>
-      <w:r>
-        <w:t xml:space="preserve">, A. C., Sheikh, H. R., &amp; Simoncelli, E. P. (2004). Image quality assessment: From error visibility to structural similarity. </w:t>
-      </w:r>
-      <w:r>
-        <w:rPr>
-          <w:i/>
-          <w:iCs/>
-        </w:rPr>
-        <w:t>IEEE Transactions on Image Processing, 13</w:t>
-      </w:r>
-      <w:r>
-        <w:t>(4), 600–612. https://doi.org/10.1109/TIP.2003.819861</w:t>
+        <w:t>Thamilarasi, V., Asaithambi, A., &amp; Roselin, R. (2025). Enhanced ensemble segmentation of lung chest X-ray images by denoising autoencoder and CLAHE. ICTACT Journal on Image and Video Processing, 15(3), 3501–3508. https://doi.org/10.21917/ijivp.2025.0496</w:t>
       </w:r>
     </w:p>
     <w:p>
       <w:pPr>
+        <w:pStyle w:val="ListParagraph"/>
+        <w:numPr>
+          <w:ilvl w:val="0"/>
+          <w:numId w:val="5"/>
+        </w:numPr>
         <w:tabs>
           <w:tab w:val="left" w:pos="720"/>
         </w:tabs>
         <w:spacing w:after="60"/>
-        <w:ind w:left="1440" w:hanging="1440"/>
+        <w:ind w:left="1440" w:hanging="1080"/>
+        <w:jc w:val="thaiDistribute"/>
       </w:pPr>
       <w:r>
-        <w:t>23.</w:t>
-      </w:r>
-      <w:r>
-        <w:tab/>
-        <w:t xml:space="preserve">World Health Organization. (2024). </w:t>
-      </w:r>
-      <w:r>
-        <w:rPr>
-          <w:i/>
-          <w:iCs/>
-        </w:rPr>
-        <w:t>The top 10 causes of death</w:t>
-      </w:r>
-      <w:r>
-        <w:t>. https://www.who.int/news-room/fact-sheets/detail/the-top-10-causes-of-death</w:t>
+        <w:t xml:space="preserve">van der Velden, B. H. M., </w:t>
+      </w:r>
+      <w:proofErr w:type="spellStart"/>
+      <w:r>
+        <w:t>Kuijf</w:t>
+      </w:r>
+      <w:proofErr w:type="spellEnd"/>
+      <w:r>
+        <w:t xml:space="preserve">, H. J., Gilhuijs, K. G. A., &amp; </w:t>
+      </w:r>
+      <w:proofErr w:type="spellStart"/>
+      <w:r>
+        <w:t>Viergever</w:t>
+      </w:r>
+      <w:proofErr w:type="spellEnd"/>
+      <w:r>
+        <w:t>, M. A. (2022). Explainable artificial intelligence (XAI) in deep learning-based medical image analysis. Medical Image Analysis, 79, 102470. https://doi.org/10.1016/j.media.2022.105420</w:t>
       </w:r>
     </w:p>
     <w:p>
-      <w:r>
-        <w:br w:type="page"/>
+      <w:pPr>
+        <w:pStyle w:val="ListParagraph"/>
+        <w:numPr>
+          <w:ilvl w:val="0"/>
+          <w:numId w:val="5"/>
+        </w:numPr>
+        <w:tabs>
+          <w:tab w:val="left" w:pos="720"/>
+        </w:tabs>
+        <w:spacing w:after="60"/>
+        <w:ind w:left="1440" w:hanging="1080"/>
+        <w:jc w:val="thaiDistribute"/>
+      </w:pPr>
+      <w:r>
+        <w:t>Wang, X., Peng, Y., Lu, L., Lu, Z., Bagheri, M., &amp; Summers, R. M. (2017). ChestX-ray8: Hospital-scale chest X-ray database and benchmarks on weakly-supervised classification and localization of common thorax diseases. In Proceedings of the IEEE Conference on Computer Vision and Pattern Recognition (CVPR) (pp. 2097–2106). https://doi.org/10.1109/CVPR.2017.369</w:t>
       </w:r>
     </w:p>
-    <w:p/>
+    <w:p>
+      <w:pPr>
+        <w:pStyle w:val="ListParagraph"/>
+        <w:numPr>
+          <w:ilvl w:val="0"/>
+          <w:numId w:val="5"/>
+        </w:numPr>
+        <w:tabs>
+          <w:tab w:val="left" w:pos="720"/>
+        </w:tabs>
+        <w:spacing w:after="60"/>
+        <w:ind w:left="1440" w:hanging="1080"/>
+        <w:jc w:val="thaiDistribute"/>
+      </w:pPr>
+      <w:r>
+        <w:t xml:space="preserve">Wang, Z., </w:t>
+      </w:r>
+      <w:proofErr w:type="spellStart"/>
+      <w:r>
+        <w:t>Bovik</w:t>
+      </w:r>
+      <w:proofErr w:type="spellEnd"/>
+      <w:r>
+        <w:t>, A. C., Sheikh, H. R., &amp; Simoncelli, E. P. (2004). Image quality assessment: From error visibility to structural similarity. IEEE Transactions on Image Processing, 13(4), 600–612. https://doi.org/10.1109/TIP.2003.819861</w:t>
+      </w:r>
+    </w:p>
+    <w:p>
+      <w:pPr>
+        <w:pStyle w:val="ListParagraph"/>
+        <w:numPr>
+          <w:ilvl w:val="0"/>
+          <w:numId w:val="5"/>
+        </w:numPr>
+        <w:tabs>
+          <w:tab w:val="left" w:pos="720"/>
+        </w:tabs>
+        <w:spacing w:after="60"/>
+        <w:ind w:left="1440" w:hanging="1080"/>
+        <w:jc w:val="thaiDistribute"/>
+      </w:pPr>
+      <w:r>
+        <w:t>World Health Organization. (2024). The top 10 causes of death. https://www.who.int/news-room/fact-sheets/detail/the-top-10-causes-of-death</w:t>
+      </w:r>
+    </w:p>
     <w:p>
       <w:pPr>
         <w:jc w:val="right"/>
@@ -39766,6 +40723,7 @@
         <w:rPr>
           <w:cs/>
         </w:rPr>
+        <w:lastRenderedPageBreak/>
         <w:t>ลงชื่อผู้ทำโครงงาน .............................................</w:t>
       </w:r>
     </w:p>
@@ -39865,13 +40823,8 @@
       </w:r>
     </w:p>
     <w:p>
-      <w:proofErr w:type="gramStart"/>
-      <w:r>
-        <w:t xml:space="preserve">(  </w:t>
-      </w:r>
-      <w:proofErr w:type="gramEnd"/>
-      <w:r>
-        <w:t xml:space="preserve"> ) </w:t>
+      <w:r>
+        <w:t xml:space="preserve">(   ) </w:t>
       </w:r>
       <w:r>
         <w:rPr>
@@ -39881,13 +40834,8 @@
       </w:r>
     </w:p>
     <w:p>
-      <w:proofErr w:type="gramStart"/>
-      <w:r>
-        <w:t xml:space="preserve">(  </w:t>
-      </w:r>
-      <w:proofErr w:type="gramEnd"/>
-      <w:r>
-        <w:t xml:space="preserve"> ) </w:t>
+      <w:r>
+        <w:t xml:space="preserve">(   ) </w:t>
       </w:r>
       <w:r>
         <w:rPr>
@@ -40027,6 +40975,92 @@
 <file path=word/numbering.xml><?xml version="1.0" encoding="utf-8"?>
 <w:numbering xmlns:wpc="http://schemas.microsoft.com/office/word/2010/wordprocessingCanvas" xmlns:cx="http://schemas.microsoft.com/office/drawing/2014/chartex" xmlns:cx1="http://schemas.microsoft.com/office/drawing/2015/9/8/chartex" xmlns:cx2="http://schemas.microsoft.com/office/drawing/2015/10/21/chartex" xmlns:cx3="http://schemas.microsoft.com/office/drawing/2016/5/9/chartex" xmlns:cx4="http://schemas.microsoft.com/office/drawing/2016/5/10/chartex" xmlns:cx5="http://schemas.microsoft.com/office/drawing/2016/5/11/chartex" xmlns:cx6="http://schemas.microsoft.com/office/drawing/2016/5/12/chartex" xmlns:cx7="http://schemas.microsoft.com/office/drawing/2016/5/13/chartex" xmlns:cx8="http://schemas.microsoft.com/office/drawing/2016/5/14/chartex" xmlns:mc="http://schemas.openxmlformats.org/markup-compatibility/2006" xmlns:aink="http://schemas.microsoft.com/office/drawing/2016/ink" xmlns:am3d="http://schemas.microsoft.com/office/drawing/2017/model3d" xmlns:o="urn:schemas-microsoft-com:office:office" xmlns:oel="http://schemas.microsoft.com/office/2019/extlst" xmlns:r="http://schemas.openxmlformats.org/officeDocument/2006/relationships" xmlns:m="http://schemas.openxmlformats.org/officeDocument/2006/math" xmlns:v="urn:schemas-microsoft-com:vml" xmlns:wp14="http://schemas.microsoft.com/office/word/2010/wordprocessingDrawing" xmlns:wp="http://schemas.openxmlformats.org/drawingml/2006/wordprocessingDrawing" xmlns:w10="urn:schemas-microsoft-com:office:word" xmlns:w="http://schemas.openxmlformats.org/wordprocessingml/2006/main" xmlns:w14="http://schemas.microsoft.com/office/word/2010/wordml" xmlns:w15="http://schemas.microsoft.com/office/word/2012/wordml" xmlns:w16cex="http://schemas.microsoft.com/office/word/2018/wordml/cex" xmlns:w16cid="http://schemas.microsoft.com/office/word/2016/wordml/cid" xmlns:w16="http://schemas.microsoft.com/office/word/2018/wordml" xmlns:w16du="http://schemas.microsoft.com/office/word/2023/wordml/word16du" xmlns:w16sdtdh="http://schemas.microsoft.com/office/word/2020/wordml/sdtdatahash" xmlns:w16sdtfl="http://schemas.microsoft.com/office/word/2024/wordml/sdtformatlock" xmlns:w16se="http://schemas.microsoft.com/office/word/2015/wordml/symex" xmlns:wpg="http://schemas.microsoft.com/office/word/2010/wordprocessingGroup" xmlns:wpi="http://schemas.microsoft.com/office/word/2010/wordprocessingInk" xmlns:wne="http://schemas.microsoft.com/office/word/2006/wordml" xmlns:wps="http://schemas.microsoft.com/office/word/2010/wordprocessingShape" mc:Ignorable="w14 w15 w16se w16cid w16 w16cex w16sdtdh w16sdtfl w16du wp14">
   <w:abstractNum w:abstractNumId="0" w15:restartNumberingAfterBreak="0">
+    <w:nsid w:val="16A448A8"/>
+    <w:multiLevelType w:val="hybridMultilevel"/>
+    <w:tmpl w:val="43BC04B2"/>
+    <w:lvl w:ilvl="0" w:tplc="0409000F">
+      <w:start w:val="1"/>
+      <w:numFmt w:val="decimal"/>
+      <w:lvlText w:val="%1."/>
+      <w:lvlJc w:val="left"/>
+      <w:pPr>
+        <w:ind w:left="720" w:hanging="360"/>
+      </w:pPr>
+    </w:lvl>
+    <w:lvl w:ilvl="1" w:tplc="04090019" w:tentative="1">
+      <w:start w:val="1"/>
+      <w:numFmt w:val="lowerLetter"/>
+      <w:lvlText w:val="%2."/>
+      <w:lvlJc w:val="left"/>
+      <w:pPr>
+        <w:ind w:left="1440" w:hanging="360"/>
+      </w:pPr>
+    </w:lvl>
+    <w:lvl w:ilvl="2" w:tplc="0409001B" w:tentative="1">
+      <w:start w:val="1"/>
+      <w:numFmt w:val="lowerRoman"/>
+      <w:lvlText w:val="%3."/>
+      <w:lvlJc w:val="right"/>
+      <w:pPr>
+        <w:ind w:left="2160" w:hanging="180"/>
+      </w:pPr>
+    </w:lvl>
+    <w:lvl w:ilvl="3" w:tplc="0409000F" w:tentative="1">
+      <w:start w:val="1"/>
+      <w:numFmt w:val="decimal"/>
+      <w:lvlText w:val="%4."/>
+      <w:lvlJc w:val="left"/>
+      <w:pPr>
+        <w:ind w:left="2880" w:hanging="360"/>
+      </w:pPr>
+    </w:lvl>
+    <w:lvl w:ilvl="4" w:tplc="04090019" w:tentative="1">
+      <w:start w:val="1"/>
+      <w:numFmt w:val="lowerLetter"/>
+      <w:lvlText w:val="%5."/>
+      <w:lvlJc w:val="left"/>
+      <w:pPr>
+        <w:ind w:left="3600" w:hanging="360"/>
+      </w:pPr>
+    </w:lvl>
+    <w:lvl w:ilvl="5" w:tplc="0409001B" w:tentative="1">
+      <w:start w:val="1"/>
+      <w:numFmt w:val="lowerRoman"/>
+      <w:lvlText w:val="%6."/>
+      <w:lvlJc w:val="right"/>
+      <w:pPr>
+        <w:ind w:left="4320" w:hanging="180"/>
+      </w:pPr>
+    </w:lvl>
+    <w:lvl w:ilvl="6" w:tplc="0409000F" w:tentative="1">
+      <w:start w:val="1"/>
+      <w:numFmt w:val="decimal"/>
+      <w:lvlText w:val="%7."/>
+      <w:lvlJc w:val="left"/>
+      <w:pPr>
+        <w:ind w:left="5040" w:hanging="360"/>
+      </w:pPr>
+    </w:lvl>
+    <w:lvl w:ilvl="7" w:tplc="04090019" w:tentative="1">
+      <w:start w:val="1"/>
+      <w:numFmt w:val="lowerLetter"/>
+      <w:lvlText w:val="%8."/>
+      <w:lvlJc w:val="left"/>
+      <w:pPr>
+        <w:ind w:left="5760" w:hanging="360"/>
+      </w:pPr>
+    </w:lvl>
+    <w:lvl w:ilvl="8" w:tplc="0409001B" w:tentative="1">
+      <w:start w:val="1"/>
+      <w:numFmt w:val="lowerRoman"/>
+      <w:lvlText w:val="%9."/>
+      <w:lvlJc w:val="right"/>
+      <w:pPr>
+        <w:ind w:left="6480" w:hanging="180"/>
+      </w:pPr>
+    </w:lvl>
+  </w:abstractNum>
+  <w:abstractNum w:abstractNumId="1" w15:restartNumberingAfterBreak="0">
     <w:nsid w:val="296E1F15"/>
     <w:multiLevelType w:val="hybridMultilevel"/>
     <w:tmpl w:val="E6B8A200"/>
@@ -40112,11 +41146,402 @@
       </w:pPr>
     </w:lvl>
   </w:abstractNum>
+  <w:abstractNum w:abstractNumId="2" w15:restartNumberingAfterBreak="0">
+    <w:nsid w:val="320D4C71"/>
+    <w:multiLevelType w:val="multilevel"/>
+    <w:tmpl w:val="95F20B3A"/>
+    <w:lvl w:ilvl="0">
+      <w:start w:val="1"/>
+      <w:numFmt w:val="decimal"/>
+      <w:lvlText w:val="%1."/>
+      <w:lvlJc w:val="left"/>
+      <w:pPr>
+        <w:tabs>
+          <w:tab w:val="num" w:pos="720"/>
+        </w:tabs>
+        <w:ind w:left="720" w:hanging="360"/>
+      </w:pPr>
+    </w:lvl>
+    <w:lvl w:ilvl="1">
+      <w:start w:val="1"/>
+      <w:numFmt w:val="bullet"/>
+      <w:lvlText w:val="o"/>
+      <w:lvlJc w:val="left"/>
+      <w:pPr>
+        <w:tabs>
+          <w:tab w:val="num" w:pos="1440"/>
+        </w:tabs>
+        <w:ind w:left="1440" w:hanging="360"/>
+      </w:pPr>
+      <w:rPr>
+        <w:rFonts w:ascii="Courier New" w:hAnsi="Courier New" w:hint="default"/>
+        <w:sz w:val="20"/>
+      </w:rPr>
+    </w:lvl>
+    <w:lvl w:ilvl="2" w:tentative="1">
+      <w:start w:val="1"/>
+      <w:numFmt w:val="decimal"/>
+      <w:lvlText w:val="%3."/>
+      <w:lvlJc w:val="left"/>
+      <w:pPr>
+        <w:tabs>
+          <w:tab w:val="num" w:pos="2160"/>
+        </w:tabs>
+        <w:ind w:left="2160" w:hanging="360"/>
+      </w:pPr>
+    </w:lvl>
+    <w:lvl w:ilvl="3" w:tentative="1">
+      <w:start w:val="1"/>
+      <w:numFmt w:val="decimal"/>
+      <w:lvlText w:val="%4."/>
+      <w:lvlJc w:val="left"/>
+      <w:pPr>
+        <w:tabs>
+          <w:tab w:val="num" w:pos="2880"/>
+        </w:tabs>
+        <w:ind w:left="2880" w:hanging="360"/>
+      </w:pPr>
+    </w:lvl>
+    <w:lvl w:ilvl="4" w:tentative="1">
+      <w:start w:val="1"/>
+      <w:numFmt w:val="decimal"/>
+      <w:lvlText w:val="%5."/>
+      <w:lvlJc w:val="left"/>
+      <w:pPr>
+        <w:tabs>
+          <w:tab w:val="num" w:pos="3600"/>
+        </w:tabs>
+        <w:ind w:left="3600" w:hanging="360"/>
+      </w:pPr>
+    </w:lvl>
+    <w:lvl w:ilvl="5" w:tentative="1">
+      <w:start w:val="1"/>
+      <w:numFmt w:val="decimal"/>
+      <w:lvlText w:val="%6."/>
+      <w:lvlJc w:val="left"/>
+      <w:pPr>
+        <w:tabs>
+          <w:tab w:val="num" w:pos="4320"/>
+        </w:tabs>
+        <w:ind w:left="4320" w:hanging="360"/>
+      </w:pPr>
+    </w:lvl>
+    <w:lvl w:ilvl="6" w:tentative="1">
+      <w:start w:val="1"/>
+      <w:numFmt w:val="decimal"/>
+      <w:lvlText w:val="%7."/>
+      <w:lvlJc w:val="left"/>
+      <w:pPr>
+        <w:tabs>
+          <w:tab w:val="num" w:pos="5040"/>
+        </w:tabs>
+        <w:ind w:left="5040" w:hanging="360"/>
+      </w:pPr>
+    </w:lvl>
+    <w:lvl w:ilvl="7" w:tentative="1">
+      <w:start w:val="1"/>
+      <w:numFmt w:val="decimal"/>
+      <w:lvlText w:val="%8."/>
+      <w:lvlJc w:val="left"/>
+      <w:pPr>
+        <w:tabs>
+          <w:tab w:val="num" w:pos="5760"/>
+        </w:tabs>
+        <w:ind w:left="5760" w:hanging="360"/>
+      </w:pPr>
+    </w:lvl>
+    <w:lvl w:ilvl="8" w:tentative="1">
+      <w:start w:val="1"/>
+      <w:numFmt w:val="decimal"/>
+      <w:lvlText w:val="%9."/>
+      <w:lvlJc w:val="left"/>
+      <w:pPr>
+        <w:tabs>
+          <w:tab w:val="num" w:pos="6480"/>
+        </w:tabs>
+        <w:ind w:left="6480" w:hanging="360"/>
+      </w:pPr>
+    </w:lvl>
+  </w:abstractNum>
+  <w:abstractNum w:abstractNumId="3" w15:restartNumberingAfterBreak="0">
+    <w:nsid w:val="544D5EC0"/>
+    <w:multiLevelType w:val="hybridMultilevel"/>
+    <w:tmpl w:val="5344E0BC"/>
+    <w:lvl w:ilvl="0" w:tplc="04090001">
+      <w:start w:val="1"/>
+      <w:numFmt w:val="bullet"/>
+      <w:lvlText w:val=""/>
+      <w:lvlJc w:val="left"/>
+      <w:pPr>
+        <w:ind w:left="720" w:hanging="360"/>
+      </w:pPr>
+      <w:rPr>
+        <w:rFonts w:ascii="Symbol" w:hAnsi="Symbol" w:hint="default"/>
+      </w:rPr>
+    </w:lvl>
+    <w:lvl w:ilvl="1" w:tplc="04090003" w:tentative="1">
+      <w:start w:val="1"/>
+      <w:numFmt w:val="bullet"/>
+      <w:lvlText w:val="o"/>
+      <w:lvlJc w:val="left"/>
+      <w:pPr>
+        <w:ind w:left="1440" w:hanging="360"/>
+      </w:pPr>
+      <w:rPr>
+        <w:rFonts w:ascii="Courier New" w:hAnsi="Courier New" w:cs="Courier New" w:hint="default"/>
+      </w:rPr>
+    </w:lvl>
+    <w:lvl w:ilvl="2" w:tplc="04090005" w:tentative="1">
+      <w:start w:val="1"/>
+      <w:numFmt w:val="bullet"/>
+      <w:lvlText w:val=""/>
+      <w:lvlJc w:val="left"/>
+      <w:pPr>
+        <w:ind w:left="2160" w:hanging="360"/>
+      </w:pPr>
+      <w:rPr>
+        <w:rFonts w:ascii="Wingdings" w:hAnsi="Wingdings" w:hint="default"/>
+      </w:rPr>
+    </w:lvl>
+    <w:lvl w:ilvl="3" w:tplc="04090001" w:tentative="1">
+      <w:start w:val="1"/>
+      <w:numFmt w:val="bullet"/>
+      <w:lvlText w:val=""/>
+      <w:lvlJc w:val="left"/>
+      <w:pPr>
+        <w:ind w:left="2880" w:hanging="360"/>
+      </w:pPr>
+      <w:rPr>
+        <w:rFonts w:ascii="Symbol" w:hAnsi="Symbol" w:hint="default"/>
+      </w:rPr>
+    </w:lvl>
+    <w:lvl w:ilvl="4" w:tplc="04090003" w:tentative="1">
+      <w:start w:val="1"/>
+      <w:numFmt w:val="bullet"/>
+      <w:lvlText w:val="o"/>
+      <w:lvlJc w:val="left"/>
+      <w:pPr>
+        <w:ind w:left="3600" w:hanging="360"/>
+      </w:pPr>
+      <w:rPr>
+        <w:rFonts w:ascii="Courier New" w:hAnsi="Courier New" w:cs="Courier New" w:hint="default"/>
+      </w:rPr>
+    </w:lvl>
+    <w:lvl w:ilvl="5" w:tplc="04090005" w:tentative="1">
+      <w:start w:val="1"/>
+      <w:numFmt w:val="bullet"/>
+      <w:lvlText w:val=""/>
+      <w:lvlJc w:val="left"/>
+      <w:pPr>
+        <w:ind w:left="4320" w:hanging="360"/>
+      </w:pPr>
+      <w:rPr>
+        <w:rFonts w:ascii="Wingdings" w:hAnsi="Wingdings" w:hint="default"/>
+      </w:rPr>
+    </w:lvl>
+    <w:lvl w:ilvl="6" w:tplc="04090001" w:tentative="1">
+      <w:start w:val="1"/>
+      <w:numFmt w:val="bullet"/>
+      <w:lvlText w:val=""/>
+      <w:lvlJc w:val="left"/>
+      <w:pPr>
+        <w:ind w:left="5040" w:hanging="360"/>
+      </w:pPr>
+      <w:rPr>
+        <w:rFonts w:ascii="Symbol" w:hAnsi="Symbol" w:hint="default"/>
+      </w:rPr>
+    </w:lvl>
+    <w:lvl w:ilvl="7" w:tplc="04090003" w:tentative="1">
+      <w:start w:val="1"/>
+      <w:numFmt w:val="bullet"/>
+      <w:lvlText w:val="o"/>
+      <w:lvlJc w:val="left"/>
+      <w:pPr>
+        <w:ind w:left="5760" w:hanging="360"/>
+      </w:pPr>
+      <w:rPr>
+        <w:rFonts w:ascii="Courier New" w:hAnsi="Courier New" w:cs="Courier New" w:hint="default"/>
+      </w:rPr>
+    </w:lvl>
+    <w:lvl w:ilvl="8" w:tplc="04090005" w:tentative="1">
+      <w:start w:val="1"/>
+      <w:numFmt w:val="bullet"/>
+      <w:lvlText w:val=""/>
+      <w:lvlJc w:val="left"/>
+      <w:pPr>
+        <w:ind w:left="6480" w:hanging="360"/>
+      </w:pPr>
+      <w:rPr>
+        <w:rFonts w:ascii="Wingdings" w:hAnsi="Wingdings" w:hint="default"/>
+      </w:rPr>
+    </w:lvl>
+  </w:abstractNum>
+  <w:abstractNum w:abstractNumId="4" w15:restartNumberingAfterBreak="0">
+    <w:nsid w:val="6B1E1A3F"/>
+    <w:multiLevelType w:val="multilevel"/>
+    <w:tmpl w:val="541648D6"/>
+    <w:lvl w:ilvl="0">
+      <w:start w:val="1"/>
+      <w:numFmt w:val="bullet"/>
+      <w:lvlText w:val=""/>
+      <w:lvlJc w:val="left"/>
+      <w:pPr>
+        <w:tabs>
+          <w:tab w:val="num" w:pos="720"/>
+        </w:tabs>
+        <w:ind w:left="720" w:hanging="360"/>
+      </w:pPr>
+      <w:rPr>
+        <w:rFonts w:ascii="Symbol" w:hAnsi="Symbol" w:hint="default"/>
+        <w:sz w:val="20"/>
+      </w:rPr>
+    </w:lvl>
+    <w:lvl w:ilvl="1" w:tentative="1">
+      <w:start w:val="1"/>
+      <w:numFmt w:val="bullet"/>
+      <w:lvlText w:val="o"/>
+      <w:lvlJc w:val="left"/>
+      <w:pPr>
+        <w:tabs>
+          <w:tab w:val="num" w:pos="1440"/>
+        </w:tabs>
+        <w:ind w:left="1440" w:hanging="360"/>
+      </w:pPr>
+      <w:rPr>
+        <w:rFonts w:ascii="Courier New" w:hAnsi="Courier New" w:hint="default"/>
+        <w:sz w:val="20"/>
+      </w:rPr>
+    </w:lvl>
+    <w:lvl w:ilvl="2" w:tentative="1">
+      <w:start w:val="1"/>
+      <w:numFmt w:val="bullet"/>
+      <w:lvlText w:val=""/>
+      <w:lvlJc w:val="left"/>
+      <w:pPr>
+        <w:tabs>
+          <w:tab w:val="num" w:pos="2160"/>
+        </w:tabs>
+        <w:ind w:left="2160" w:hanging="360"/>
+      </w:pPr>
+      <w:rPr>
+        <w:rFonts w:ascii="Wingdings" w:hAnsi="Wingdings" w:hint="default"/>
+        <w:sz w:val="20"/>
+      </w:rPr>
+    </w:lvl>
+    <w:lvl w:ilvl="3" w:tentative="1">
+      <w:start w:val="1"/>
+      <w:numFmt w:val="bullet"/>
+      <w:lvlText w:val=""/>
+      <w:lvlJc w:val="left"/>
+      <w:pPr>
+        <w:tabs>
+          <w:tab w:val="num" w:pos="2880"/>
+        </w:tabs>
+        <w:ind w:left="2880" w:hanging="360"/>
+      </w:pPr>
+      <w:rPr>
+        <w:rFonts w:ascii="Wingdings" w:hAnsi="Wingdings" w:hint="default"/>
+        <w:sz w:val="20"/>
+      </w:rPr>
+    </w:lvl>
+    <w:lvl w:ilvl="4" w:tentative="1">
+      <w:start w:val="1"/>
+      <w:numFmt w:val="bullet"/>
+      <w:lvlText w:val=""/>
+      <w:lvlJc w:val="left"/>
+      <w:pPr>
+        <w:tabs>
+          <w:tab w:val="num" w:pos="3600"/>
+        </w:tabs>
+        <w:ind w:left="3600" w:hanging="360"/>
+      </w:pPr>
+      <w:rPr>
+        <w:rFonts w:ascii="Wingdings" w:hAnsi="Wingdings" w:hint="default"/>
+        <w:sz w:val="20"/>
+      </w:rPr>
+    </w:lvl>
+    <w:lvl w:ilvl="5" w:tentative="1">
+      <w:start w:val="1"/>
+      <w:numFmt w:val="bullet"/>
+      <w:lvlText w:val=""/>
+      <w:lvlJc w:val="left"/>
+      <w:pPr>
+        <w:tabs>
+          <w:tab w:val="num" w:pos="4320"/>
+        </w:tabs>
+        <w:ind w:left="4320" w:hanging="360"/>
+      </w:pPr>
+      <w:rPr>
+        <w:rFonts w:ascii="Wingdings" w:hAnsi="Wingdings" w:hint="default"/>
+        <w:sz w:val="20"/>
+      </w:rPr>
+    </w:lvl>
+    <w:lvl w:ilvl="6" w:tentative="1">
+      <w:start w:val="1"/>
+      <w:numFmt w:val="bullet"/>
+      <w:lvlText w:val=""/>
+      <w:lvlJc w:val="left"/>
+      <w:pPr>
+        <w:tabs>
+          <w:tab w:val="num" w:pos="5040"/>
+        </w:tabs>
+        <w:ind w:left="5040" w:hanging="360"/>
+      </w:pPr>
+      <w:rPr>
+        <w:rFonts w:ascii="Wingdings" w:hAnsi="Wingdings" w:hint="default"/>
+        <w:sz w:val="20"/>
+      </w:rPr>
+    </w:lvl>
+    <w:lvl w:ilvl="7" w:tentative="1">
+      <w:start w:val="1"/>
+      <w:numFmt w:val="bullet"/>
+      <w:lvlText w:val=""/>
+      <w:lvlJc w:val="left"/>
+      <w:pPr>
+        <w:tabs>
+          <w:tab w:val="num" w:pos="5760"/>
+        </w:tabs>
+        <w:ind w:left="5760" w:hanging="360"/>
+      </w:pPr>
+      <w:rPr>
+        <w:rFonts w:ascii="Wingdings" w:hAnsi="Wingdings" w:hint="default"/>
+        <w:sz w:val="20"/>
+      </w:rPr>
+    </w:lvl>
+    <w:lvl w:ilvl="8" w:tentative="1">
+      <w:start w:val="1"/>
+      <w:numFmt w:val="bullet"/>
+      <w:lvlText w:val=""/>
+      <w:lvlJc w:val="left"/>
+      <w:pPr>
+        <w:tabs>
+          <w:tab w:val="num" w:pos="6480"/>
+        </w:tabs>
+        <w:ind w:left="6480" w:hanging="360"/>
+      </w:pPr>
+      <w:rPr>
+        <w:rFonts w:ascii="Wingdings" w:hAnsi="Wingdings" w:hint="default"/>
+        <w:sz w:val="20"/>
+      </w:rPr>
+    </w:lvl>
+  </w:abstractNum>
   <w:num w:numId="1" w16cid:durableId="1688098849">
-    <w:abstractNumId w:val="0"/>
+    <w:abstractNumId w:val="1"/>
     <w:lvlOverride w:ilvl="0">
       <w:startOverride w:val="1"/>
     </w:lvlOverride>
+  </w:num>
+  <w:num w:numId="2" w16cid:durableId="294214210">
+    <w:abstractNumId w:val="2"/>
+  </w:num>
+  <w:num w:numId="3" w16cid:durableId="1194535947">
+    <w:abstractNumId w:val="4"/>
+  </w:num>
+  <w:num w:numId="4" w16cid:durableId="99764417">
+    <w:abstractNumId w:val="3"/>
+  </w:num>
+  <w:num w:numId="5" w16cid:durableId="1941638771">
+    <w:abstractNumId w:val="0"/>
   </w:num>
 </w:numbering>
 </file>
@@ -40737,6 +42162,28 @@
       <w:szCs w:val="20"/>
     </w:rPr>
   </w:style>
+  <w:style w:type="character" w:styleId="PlaceholderText">
+    <w:name w:val="Placeholder Text"/>
+    <w:basedOn w:val="DefaultParagraphFont"/>
+    <w:uiPriority w:val="99"/>
+    <w:semiHidden/>
+    <w:rsid w:val="008F1D56"/>
+    <w:rPr>
+      <w:color w:val="666666"/>
+    </w:rPr>
+  </w:style>
+  <w:style w:type="character" w:styleId="UnresolvedMention">
+    <w:name w:val="Unresolved Mention"/>
+    <w:basedOn w:val="DefaultParagraphFont"/>
+    <w:uiPriority w:val="99"/>
+    <w:semiHidden/>
+    <w:unhideWhenUsed/>
+    <w:rsid w:val="00015C29"/>
+    <w:rPr>
+      <w:color w:val="605E5C"/>
+      <w:shd w:val="clear" w:color="auto" w:fill="E1DFDD"/>
+    </w:rPr>
+  </w:style>
 </w:styles>
 </file>
 

</xml_diff>